<commit_message>
Unificar informe, diagramas y scripts en un mismo modelo
Se toma como base el modelo del informe (producto como supertipo con
planta e insumo como subtipos, sin servicios, PK sustitutas, cascadas)
y se suman precio histórico en los detalles, stock mínimo, baja lógica
y triggers de stock, fechas y exclusión de subtipos.

- Scripts: schema, FKs, índices, triggers, datos y consultas reescritos;
  17 consultas y 20 pruebas negativas verificadas en MySQL 8.4.
- Diagramas: DER y EER actualizados, cardinalidades corregidas y PNG
  re-exportados.
- Informe: secciones 4 a 7 actualizadas y DER nuevo en la sección 6.
- README: estructura, modelo y decisiones de diseño.
</commit_message>
<xml_diff>
--- a/Informe.docx
+++ b/Informe.docx
@@ -480,35 +480,7 @@
                 <w:sz w:val="20"/>
                 <w:szCs w:val="20"/>
               </w:rPr>
-              <w:t xml:space="preserve">Ing. Alejandro Jorge Behringer/ Lic. </w:t>
-            </w:r>
-            <w:r>
-              <w:rPr>
-                <w:sz w:val="20"/>
-                <w:szCs w:val="20"/>
-              </w:rPr>
-              <w:t xml:space="preserve">Jonathan Gabriel </w:t>
-            </w:r>
-            <w:r>
-              <w:rPr>
-                <w:sz w:val="20"/>
-                <w:szCs w:val="20"/>
-              </w:rPr>
-              <w:t>P</w:t>
-            </w:r>
-            <w:r>
-              <w:rPr>
-                <w:sz w:val="20"/>
-                <w:szCs w:val="20"/>
-              </w:rPr>
-              <w:t>é</w:t>
-            </w:r>
-            <w:r>
-              <w:rPr>
-                <w:sz w:val="20"/>
-                <w:szCs w:val="20"/>
-              </w:rPr>
-              <w:t>cora</w:t>
+              <w:t xml:space="preserve">Ing. Alejandro Jorge Behringer/ Lic. Jonathan Gabriel Pécora</w:t>
             </w:r>
           </w:p>
         </w:tc>
@@ -1439,13 +1411,7 @@
           </w:tcPr>
           <w:p>
             <w:r>
-              <w:t xml:space="preserve">El proyecto se enmarca en la digitalización y optimización de </w:t>
-            </w:r>
-            <w:r>
-              <w:t>la gestión</w:t>
-            </w:r>
-            <w:r>
-              <w:t xml:space="preserve"> de un vivero</w:t>
+              <w:t xml:space="preserve">El proyecto se enmarca en la digitalización y optimización de la gestión de un vivero</w:t>
             </w:r>
             <w:r>
               <w:rPr>
@@ -1455,19 +1421,7 @@
               <w:t xml:space="preserve"> </w:t>
             </w:r>
             <w:r>
-              <w:t>comercial dedicado a la comercialización minorista de especies vegetales (plantas de interior y exterior, arbustos, árboles frutales y ornamentales), así como a la venta de insumos complementarios (sustratos, fertilizantes, ma</w:t>
-            </w:r>
-            <w:r>
-              <w:t>c</w:t>
-            </w:r>
-            <w:r>
-              <w:t>e</w:t>
-            </w:r>
-            <w:r>
-              <w:t>ta</w:t>
-            </w:r>
-            <w:r>
-              <w:t>s y herramientas de jardinería).</w:t>
+              <w:t>comercial dedicado a la comercialización minorista de especies vegetales (plantas de interior y exterior, arbustos, árboles frutales y ornamentales), así como a la venta de insumos complementarios (sustratos, fertilizantes, macetas y herramientas de jardinería).</w:t>
             </w:r>
           </w:p>
           <w:p>
@@ -1487,35 +1441,10 @@
                 <w:i/>
                 <w:iCs/>
               </w:rPr>
-              <w:t>Vendedor</w:t>
-            </w:r>
-            <w:r>
-              <w:rPr>
-                <w:i/>
-                <w:iCs/>
-              </w:rPr>
-              <w:t>:</w:t>
-            </w:r>
-            <w:r>
-              <w:t xml:space="preserve"> Encargado de la gestión de </w:t>
-            </w:r>
-            <w:r>
-              <w:t>clientes</w:t>
-            </w:r>
-            <w:r>
-              <w:t xml:space="preserve">, </w:t>
-            </w:r>
-            <w:r>
-              <w:t>transacciones</w:t>
-            </w:r>
-            <w:r>
-              <w:t xml:space="preserve">, </w:t>
-            </w:r>
-            <w:r>
-              <w:t xml:space="preserve">compra de mercadería, </w:t>
-            </w:r>
-            <w:r>
-              <w:t>control general de finanzas y altas/bajas de productos.</w:t>
+              <w:t>Vendedor:</w:t>
+            </w:r>
+            <w:r>
+              <w:t xml:space="preserve"> Encargado de la gestión de clientes, transacciones, compra de mercadería, control general de finanzas y altas/bajas de productos.</w:t>
             </w:r>
           </w:p>
           <w:p>
@@ -1530,30 +1459,10 @@
                 <w:i/>
                 <w:iCs/>
               </w:rPr>
-              <w:t>Cliente</w:t>
-            </w:r>
-            <w:r>
-              <w:rPr>
-                <w:i/>
-                <w:iCs/>
-              </w:rPr>
-              <w:t>:</w:t>
-            </w:r>
-            <w:r>
-              <w:rPr>
-                <w:i/>
-                <w:iCs/>
-              </w:rPr>
-              <w:t xml:space="preserve"> </w:t>
-            </w:r>
-            <w:r>
-              <w:t>Persona a la que se le realiza la venta</w:t>
-            </w:r>
-            <w:r>
-              <w:t xml:space="preserve">. </w:t>
-            </w:r>
-            <w:r>
-              <w:t xml:space="preserve"> </w:t>
+              <w:t xml:space="preserve">Cliente: </w:t>
+            </w:r>
+            <w:r>
+              <w:t xml:space="preserve">Persona a la que se le realiza la venta.  </w:t>
             </w:r>
           </w:p>
           <w:p>
@@ -1568,21 +1477,7 @@
                 <w:i/>
                 <w:iCs/>
               </w:rPr>
-              <w:t>P</w:t>
-            </w:r>
-            <w:r>
-              <w:rPr>
-                <w:i/>
-                <w:iCs/>
-              </w:rPr>
-              <w:t>roveedor</w:t>
-            </w:r>
-            <w:r>
-              <w:rPr>
-                <w:i/>
-                <w:iCs/>
-              </w:rPr>
-              <w:t>:</w:t>
+              <w:t>Proveedor:</w:t>
             </w:r>
             <w:r>
               <w:t xml:space="preserve"> Encargado del ingreso de nueva mercadería.</w:t>
@@ -1643,24 +1538,12 @@
           </w:tcPr>
           <w:p>
             <w:r>
-              <w:t>El objetivo principal del</w:t>
-            </w:r>
-            <w:r>
-              <w:t xml:space="preserve"> proyecto</w:t>
-            </w:r>
-            <w:r>
-              <w:t xml:space="preserve"> es diseñar e implementar una base de datos relacional robusta y normalizada que centralice, ordene y asegure la integridad de toda la información crítica del vivero. El sistema busca resolver el problema de la fragmentación de datos y la falta de control en tiempo real sobre el inventario y las transacciones comerciales.</w:t>
-            </w:r>
-          </w:p>
-          <w:p>
-            <w:r>
-              <w:t xml:space="preserve">A nivel técnico y operativo, la base de datos </w:t>
-            </w:r>
-            <w:r>
-              <w:t>eliminará</w:t>
-            </w:r>
-            <w:r>
-              <w:t xml:space="preserve"> la redundancia de datos mediante la correcta aplicación de formas normales. Asimismo, permitirá automatizar el seguimiento del stock disponible, registrar de manera estructurada las ventas y los pagos, y facilitar consultas complejas y reportes gerenciales (tales como productos con bajo stock, historial de compras por cliente y niveles de ventas por período) para optimizar la gestión administrativa y comercial del establecimiento.</w:t>
+              <w:t xml:space="preserve">El objetivo principal del proyecto es diseñar e implementar una base de datos relacional robusta y normalizada que centralice, ordene y asegure la integridad de toda la información crítica del vivero. El sistema busca resolver el problema de la fragmentación de datos y la falta de control en tiempo real sobre el inventario y las transacciones comerciales.</w:t>
+            </w:r>
+          </w:p>
+          <w:p>
+            <w:r>
+              <w:t xml:space="preserve">A nivel técnico y operativo, la base de datos eliminará la redundancia de datos mediante la correcta aplicación de formas normales. Asimismo, permitirá automatizar el seguimiento del stock disponible, registrar de manera estructurada las ventas y los pagos, y facilitar consultas complejas y reportes gerenciales (tales como productos con bajo stock, historial de compras por cliente y niveles de ventas por período) para optimizar la gestión administrativa y comercial del establecimiento.</w:t>
             </w:r>
           </w:p>
         </w:tc>
@@ -1947,15 +1830,6 @@
           <w:szCs w:val="30"/>
         </w:rPr>
         <w:br w:type="page"/>
-      </w:r>
-      <w:r>
-        <w:rPr>
-          <w:b/>
-          <w:bCs/>
-          <w:color w:val="1F2A44"/>
-          <w:sz w:val="30"/>
-          <w:szCs w:val="30"/>
-        </w:rPr>
         <w:lastRenderedPageBreak/>
         <w:t>3. Relevamiento de Requerimientos</w:t>
       </w:r>
@@ -2530,21 +2404,65 @@
                 <w:sz w:val="22"/>
                 <w:szCs w:val="22"/>
               </w:rPr>
-              <w:t>Las consultas de búsqueda de productos por nombre o categoría, así como el procesamiento de la venta</w:t>
-            </w:r>
+              <w:t xml:space="preserve">Las consultas de búsqueda de productos por nombre o categoría, así como el procesamiento de la venta se agilizan en gran medida garantizando fluidez en la atención al cliente.</w:t>
+            </w:r>
+          </w:p>
+        </w:tc>
+      </w:tr>
+      <w:tr>
+        <w:tc>
+          <w:tcPr>
+            <w:tcW w:w="1200" w:type="dxa"/>
+            <w:tcBorders>
+              <w:top w:val="single" w:sz="4" w:space="0" w:color="D9D9D9"/>
+              <w:left w:val="single" w:sz="4" w:space="0" w:color="D9D9D9"/>
+              <w:bottom w:val="single" w:sz="4" w:space="0" w:color="D9D9D9"/>
+              <w:right w:val="single" w:sz="4" w:space="0" w:color="D9D9D9"/>
+            </w:tcBorders>
+            <w:shd w:val="clear" w:color="auto" w:fill="FFF9D6"/>
+            <w:tcMar>
+              <w:top w:w="100" w:type="dxa"/>
+              <w:left w:w="150" w:type="dxa"/>
+              <w:bottom w:w="100" w:type="dxa"/>
+              <w:right w:w="150" w:type="dxa"/>
+            </w:tcMar>
+            <w:vAlign w:val="center"/>
+          </w:tcPr>
+          <w:p>
+            <w:r>
+              <w:rPr>
+                <w:sz w:val="19"/>
+                <w:szCs w:val="19"/>
+              </w:rPr>
+              <w:t>RNF-02</w:t>
+            </w:r>
+          </w:p>
+        </w:tc>
+        <w:tc>
+          <w:tcPr>
+            <w:tcW w:w="7826" w:type="dxa"/>
+            <w:tcBorders>
+              <w:top w:val="single" w:sz="4" w:space="0" w:color="D9D9D9"/>
+              <w:left w:val="single" w:sz="4" w:space="0" w:color="D9D9D9"/>
+              <w:bottom w:val="single" w:sz="4" w:space="0" w:color="D9D9D9"/>
+              <w:right w:val="single" w:sz="4" w:space="0" w:color="D9D9D9"/>
+            </w:tcBorders>
+            <w:shd w:val="clear" w:color="auto" w:fill="FFF9D6"/>
+            <w:tcMar>
+              <w:top w:w="100" w:type="dxa"/>
+              <w:left w:w="150" w:type="dxa"/>
+              <w:bottom w:w="100" w:type="dxa"/>
+              <w:right w:w="150" w:type="dxa"/>
+            </w:tcMar>
+            <w:vAlign w:val="center"/>
+          </w:tcPr>
+          <w:p>
             <w:r>
               <w:rPr>
                 <w:sz w:val="22"/>
                 <w:szCs w:val="22"/>
               </w:rPr>
-              <w:t xml:space="preserve"> se agilizan en gran medida</w:t>
-            </w:r>
-            <w:r>
-              <w:rPr>
-                <w:sz w:val="22"/>
-                <w:szCs w:val="22"/>
-              </w:rPr>
-              <w:t xml:space="preserve"> garantizando fluidez en la atención al cliente.</w:t>
+              <w:t xml:space="preserve">Garantizar la consistencia transaccional y la prevención de anomalías en la integridad de los datos y la aplicación de restricciones de integridad referencial, en cuanto a claves primarias y foráneas.</w:t>
             </w:r>
           </w:p>
         </w:tc>
@@ -2574,7 +2492,7 @@
                 <w:sz w:val="19"/>
                 <w:szCs w:val="19"/>
               </w:rPr>
-              <w:t>RNF-02</w:t>
+              <w:t>RNF-03</w:t>
             </w:r>
           </w:p>
         </w:tc>
@@ -2598,102 +2516,7 @@
           </w:tcPr>
           <w:p>
             <w:r>
-              <w:rPr>
-                <w:sz w:val="22"/>
-                <w:szCs w:val="22"/>
-              </w:rPr>
-              <w:t xml:space="preserve">Garantizar la consistencia transaccional y la prevención de anomalías </w:t>
-            </w:r>
-            <w:r>
-              <w:rPr>
-                <w:sz w:val="22"/>
-                <w:szCs w:val="22"/>
-              </w:rPr>
-              <w:t xml:space="preserve">en la integridad de los datos </w:t>
-            </w:r>
-            <w:r>
-              <w:rPr>
-                <w:sz w:val="22"/>
-                <w:szCs w:val="22"/>
-              </w:rPr>
-              <w:t>y la aplicación de restricciones de integridad referencial</w:t>
-            </w:r>
-            <w:r>
-              <w:rPr>
-                <w:sz w:val="22"/>
-                <w:szCs w:val="22"/>
-              </w:rPr>
-              <w:t xml:space="preserve">, en cuanto a </w:t>
-            </w:r>
-            <w:r>
-              <w:rPr>
-                <w:sz w:val="22"/>
-                <w:szCs w:val="22"/>
-              </w:rPr>
-              <w:t>claves primarias y foráneas.</w:t>
-            </w:r>
-          </w:p>
-        </w:tc>
-      </w:tr>
-      <w:tr>
-        <w:tc>
-          <w:tcPr>
-            <w:tcW w:w="1200" w:type="dxa"/>
-            <w:tcBorders>
-              <w:top w:val="single" w:sz="4" w:space="0" w:color="D9D9D9"/>
-              <w:left w:val="single" w:sz="4" w:space="0" w:color="D9D9D9"/>
-              <w:bottom w:val="single" w:sz="4" w:space="0" w:color="D9D9D9"/>
-              <w:right w:val="single" w:sz="4" w:space="0" w:color="D9D9D9"/>
-            </w:tcBorders>
-            <w:shd w:val="clear" w:color="auto" w:fill="FFF9D6"/>
-            <w:tcMar>
-              <w:top w:w="100" w:type="dxa"/>
-              <w:left w:w="150" w:type="dxa"/>
-              <w:bottom w:w="100" w:type="dxa"/>
-              <w:right w:w="150" w:type="dxa"/>
-            </w:tcMar>
-            <w:vAlign w:val="center"/>
-          </w:tcPr>
-          <w:p>
-            <w:r>
-              <w:rPr>
-                <w:sz w:val="19"/>
-                <w:szCs w:val="19"/>
-              </w:rPr>
-              <w:t>RNF-03</w:t>
-            </w:r>
-          </w:p>
-        </w:tc>
-        <w:tc>
-          <w:tcPr>
-            <w:tcW w:w="7826" w:type="dxa"/>
-            <w:tcBorders>
-              <w:top w:val="single" w:sz="4" w:space="0" w:color="D9D9D9"/>
-              <w:left w:val="single" w:sz="4" w:space="0" w:color="D9D9D9"/>
-              <w:bottom w:val="single" w:sz="4" w:space="0" w:color="D9D9D9"/>
-              <w:right w:val="single" w:sz="4" w:space="0" w:color="D9D9D9"/>
-            </w:tcBorders>
-            <w:shd w:val="clear" w:color="auto" w:fill="FFF9D6"/>
-            <w:tcMar>
-              <w:top w:w="100" w:type="dxa"/>
-              <w:left w:w="150" w:type="dxa"/>
-              <w:bottom w:w="100" w:type="dxa"/>
-              <w:right w:w="150" w:type="dxa"/>
-            </w:tcMar>
-            <w:vAlign w:val="center"/>
-          </w:tcPr>
-          <w:p>
-            <w:r>
-              <w:t>Dimensionar la base de datos, de forma tal que permita</w:t>
-            </w:r>
-            <w:r>
-              <w:t xml:space="preserve"> gestionar un volumen inicial proyectado de 50.000 registros anuales de ventas y un catálogo activo de hasta 10.000 productos y lotes de insumos, </w:t>
-            </w:r>
-            <w:r>
-              <w:t>permitiendo la escalabilidad del sistema</w:t>
-            </w:r>
-            <w:r>
-              <w:t>.</w:t>
+              <w:t xml:space="preserve">Dimensionar la base de datos, de forma tal que permita gestionar un volumen inicial proyectado de 50.000 registros anuales de ventas y un catálogo activo de hasta 10.000 productos y lotes de insumos, permitiendo la escalabilidad del sistema.</w:t>
             </w:r>
           </w:p>
         </w:tc>
@@ -2963,10 +2786,7 @@
           </w:tcPr>
           <w:p>
             <w:r>
-              <w:t>v</w:t>
-            </w:r>
-            <w:r>
-              <w:t>endedor</w:t>
+              <w:t>vendedor</w:t>
             </w:r>
           </w:p>
         </w:tc>
@@ -3304,7 +3124,7 @@
           </w:tcPr>
           <w:p>
             <w:r>
-              <w:t>inventario</w:t>
+              <w:t xml:space="preserve">producto</w:t>
             </w:r>
           </w:p>
         </w:tc>
@@ -3328,7 +3148,7 @@
           </w:tcPr>
           <w:p>
             <w:r>
-              <w:t>fuerte</w:t>
+              <w:t xml:space="preserve">fuerte</w:t>
             </w:r>
           </w:p>
         </w:tc>
@@ -3363,7 +3183,7 @@
                 <w:sz w:val="22"/>
                 <w:szCs w:val="22"/>
               </w:rPr>
-              <w:t xml:space="preserve">Entidad central de stock que consolida el control de existencias, precios de compra y precios de venta de cada artículo comercial. </w:t>
+              <w:t xml:space="preserve">Entidad central (supertipo) que consolida el control de existencias, el stock mínimo, los precios de compra y de venta y el estado (activo o dado de baja) de cada artículo comercial.</w:t>
             </w:r>
           </w:p>
         </w:tc>
@@ -3447,7 +3267,7 @@
           </w:tcPr>
           <w:p>
             <w:r>
-              <w:t>débil</w:t>
+              <w:t xml:space="preserve">fuerte (subtipo de producto)</w:t>
             </w:r>
           </w:p>
         </w:tc>
@@ -3482,7 +3302,7 @@
                 <w:sz w:val="22"/>
                 <w:szCs w:val="22"/>
               </w:rPr>
-              <w:t xml:space="preserve">Entidad especializada que registra las características botánicas y requerimientos de cuidado, dependiendo operacionalmente del registro de inventario. </w:t>
+              <w:t xml:space="preserve">Subtipo de producto que registra el nombre, la categoría, las características botánicas y los requerimientos de cuidado de cada planta.</w:t>
             </w:r>
           </w:p>
         </w:tc>
@@ -3566,7 +3386,7 @@
           </w:tcPr>
           <w:p>
             <w:r>
-              <w:t>débil</w:t>
+              <w:t xml:space="preserve">fuerte (subtipo de producto)</w:t>
             </w:r>
           </w:p>
         </w:tc>
@@ -3601,7 +3421,7 @@
                 <w:sz w:val="22"/>
                 <w:szCs w:val="22"/>
               </w:rPr>
-              <w:t xml:space="preserve">Almacena el catálogo de herramientas, sustratos y productos no vegetales, dependiendo jerárquicamente del registro de inventario. </w:t>
+              <w:t xml:space="preserve">Subtipo de producto que registra el catálogo de herramientas, sustratos y productos no vegetales.</w:t>
             </w:r>
           </w:p>
         </w:tc>
@@ -3685,7 +3505,7 @@
           </w:tcPr>
           <w:p>
             <w:r>
-              <w:t>débil</w:t>
+              <w:t xml:space="preserve">fuerte</w:t>
             </w:r>
           </w:p>
         </w:tc>
@@ -3720,14 +3540,126 @@
                 <w:sz w:val="22"/>
                 <w:szCs w:val="22"/>
               </w:rPr>
-              <w:t>Registra la cabecera de las transacciones comerciales realizadas (fecha, forma de pago, total), vinculando obligatoriamente al cliente y al vendedor que la efectúan</w:t>
-            </w:r>
-            <w:r>
+              <w:t>Registra la cabecera de las transacciones comerciales realizadas (fecha, forma de pago, total), vinculando obligatoriamente al cliente y al vendedor que la efectúan.</w:t>
+            </w:r>
+          </w:p>
+        </w:tc>
+      </w:tr>
+      <w:tr>
+        <w:tc>
+          <w:tcPr>
+            <w:tcW w:w="700" w:type="dxa"/>
+            <w:tcBorders>
+              <w:top w:val="single" w:sz="4" w:space="0" w:color="D9D9D9"/>
+              <w:left w:val="single" w:sz="4" w:space="0" w:color="D9D9D9"/>
+              <w:bottom w:val="single" w:sz="4" w:space="0" w:color="D9D9D9"/>
+              <w:right w:val="single" w:sz="4" w:space="0" w:color="D9D9D9"/>
+            </w:tcBorders>
+            <w:shd w:val="clear" w:color="auto" w:fill="FFF9D6"/>
+            <w:tcMar>
+              <w:top w:w="100" w:type="dxa"/>
+              <w:left w:w="150" w:type="dxa"/>
+              <w:bottom w:w="100" w:type="dxa"/>
+              <w:right w:w="150" w:type="dxa"/>
+            </w:tcMar>
+            <w:vAlign w:val="center"/>
+          </w:tcPr>
+          <w:p>
+            <w:pPr>
+              <w:rPr>
+                <w:sz w:val="19"/>
+                <w:szCs w:val="19"/>
+              </w:rPr>
+            </w:pPr>
+            <w:r>
+              <w:rPr>
+                <w:sz w:val="19"/>
+                <w:szCs w:val="19"/>
+              </w:rPr>
+              <w:t>8</w:t>
+            </w:r>
+          </w:p>
+        </w:tc>
+        <w:tc>
+          <w:tcPr>
+            <w:tcW w:w="2200" w:type="dxa"/>
+            <w:tcBorders>
+              <w:top w:val="single" w:sz="4" w:space="0" w:color="D9D9D9"/>
+              <w:left w:val="single" w:sz="4" w:space="0" w:color="D9D9D9"/>
+              <w:bottom w:val="single" w:sz="4" w:space="0" w:color="D9D9D9"/>
+              <w:right w:val="single" w:sz="4" w:space="0" w:color="D9D9D9"/>
+            </w:tcBorders>
+            <w:shd w:val="clear" w:color="auto" w:fill="FFF9D6"/>
+            <w:tcMar>
+              <w:top w:w="100" w:type="dxa"/>
+              <w:left w:w="150" w:type="dxa"/>
+              <w:bottom w:w="100" w:type="dxa"/>
+              <w:right w:w="150" w:type="dxa"/>
+            </w:tcMar>
+            <w:vAlign w:val="center"/>
+          </w:tcPr>
+          <w:p>
+            <w:r>
+              <w:t>detalle_venta</w:t>
+            </w:r>
+          </w:p>
+        </w:tc>
+        <w:tc>
+          <w:tcPr>
+            <w:tcW w:w="2100" w:type="dxa"/>
+            <w:tcBorders>
+              <w:top w:val="single" w:sz="4" w:space="0" w:color="D9D9D9"/>
+              <w:left w:val="single" w:sz="4" w:space="0" w:color="D9D9D9"/>
+              <w:bottom w:val="single" w:sz="4" w:space="0" w:color="D9D9D9"/>
+              <w:right w:val="single" w:sz="4" w:space="0" w:color="D9D9D9"/>
+            </w:tcBorders>
+            <w:shd w:val="clear" w:color="auto" w:fill="FFF9D6"/>
+            <w:tcMar>
+              <w:top w:w="100" w:type="dxa"/>
+              <w:left w:w="150" w:type="dxa"/>
+              <w:bottom w:w="100" w:type="dxa"/>
+              <w:right w:w="150" w:type="dxa"/>
+            </w:tcMar>
+            <w:vAlign w:val="center"/>
+          </w:tcPr>
+          <w:p>
+            <w:r>
+              <w:t>débil</w:t>
+            </w:r>
+          </w:p>
+        </w:tc>
+        <w:tc>
+          <w:tcPr>
+            <w:tcW w:w="4026" w:type="dxa"/>
+            <w:tcBorders>
+              <w:top w:val="single" w:sz="4" w:space="0" w:color="D9D9D9"/>
+              <w:left w:val="single" w:sz="4" w:space="0" w:color="D9D9D9"/>
+              <w:bottom w:val="single" w:sz="4" w:space="0" w:color="D9D9D9"/>
+              <w:right w:val="single" w:sz="4" w:space="0" w:color="D9D9D9"/>
+            </w:tcBorders>
+            <w:shd w:val="clear" w:color="auto" w:fill="FFF9D6"/>
+            <w:tcMar>
+              <w:top w:w="100" w:type="dxa"/>
+              <w:left w:w="150" w:type="dxa"/>
+              <w:bottom w:w="100" w:type="dxa"/>
+              <w:right w:w="150" w:type="dxa"/>
+            </w:tcMar>
+            <w:vAlign w:val="center"/>
+          </w:tcPr>
+          <w:p>
+            <w:pPr>
+              <w:spacing w:before="240" w:after="120"/>
               <w:rPr>
                 <w:sz w:val="22"/>
                 <w:szCs w:val="22"/>
               </w:rPr>
-              <w:t>.</w:t>
+            </w:pPr>
+            <w:r>
+              <w:rPr>
+                <w:sz w:val="22"/>
+                <w:szCs w:val="22"/>
+              </w:rPr>
+              <w:t xml:space="preserve">Entidad intermedia entre venta y producto, especificando la cantidad, el precio unitario y el subtotal de cada ítem vendido.</w:t>
             </w:r>
           </w:p>
         </w:tc>
@@ -3763,7 +3695,8 @@
                 <w:sz w:val="19"/>
                 <w:szCs w:val="19"/>
               </w:rPr>
-              <w:t>8</w:t>
+              <w:lastRenderedPageBreak/>
+              <w:t>9</w:t>
             </w:r>
           </w:p>
         </w:tc>
@@ -3787,7 +3720,7 @@
           </w:tcPr>
           <w:p>
             <w:r>
-              <w:t>detalle_venta</w:t>
+              <w:t>compra</w:t>
             </w:r>
           </w:p>
         </w:tc>
@@ -3811,7 +3744,7 @@
           </w:tcPr>
           <w:p>
             <w:r>
-              <w:t>débil</w:t>
+              <w:t xml:space="preserve">fuerte</w:t>
             </w:r>
           </w:p>
         </w:tc>
@@ -3846,7 +3779,7 @@
                 <w:sz w:val="22"/>
                 <w:szCs w:val="22"/>
               </w:rPr>
-              <w:t xml:space="preserve">Entidad intermedia entre venta e inventario, especificando las cantidades y subtotales por cada ítem vendido. </w:t>
+              <w:t>Registra los encabezados de los pedidos de reabastecimiento o adquisiciones realizadas a los proveedores (fecha, forma de pago, total facturado).</w:t>
             </w:r>
           </w:p>
         </w:tc>
@@ -3882,8 +3815,7 @@
                 <w:sz w:val="19"/>
                 <w:szCs w:val="19"/>
               </w:rPr>
-              <w:lastRenderedPageBreak/>
-              <w:t>9</w:t>
+              <w:t>10</w:t>
             </w:r>
           </w:p>
         </w:tc>
@@ -3907,7 +3839,7 @@
           </w:tcPr>
           <w:p>
             <w:r>
-              <w:t>compra</w:t>
+              <w:t>detalle_compra</w:t>
             </w:r>
           </w:p>
         </w:tc>
@@ -3966,161 +3898,7 @@
                 <w:sz w:val="22"/>
                 <w:szCs w:val="22"/>
               </w:rPr>
-              <w:t>Registra los encabezados de los pedidos de reabastecimiento o adquisiciones realizadas a los proveedores (fecha, forma de pago, total facturado</w:t>
-            </w:r>
-            <w:r>
-              <w:rPr>
-                <w:sz w:val="22"/>
-                <w:szCs w:val="22"/>
-              </w:rPr>
-              <w:t>).</w:t>
-            </w:r>
-          </w:p>
-        </w:tc>
-      </w:tr>
-      <w:tr>
-        <w:tc>
-          <w:tcPr>
-            <w:tcW w:w="700" w:type="dxa"/>
-            <w:tcBorders>
-              <w:top w:val="single" w:sz="4" w:space="0" w:color="D9D9D9"/>
-              <w:left w:val="single" w:sz="4" w:space="0" w:color="D9D9D9"/>
-              <w:bottom w:val="single" w:sz="4" w:space="0" w:color="D9D9D9"/>
-              <w:right w:val="single" w:sz="4" w:space="0" w:color="D9D9D9"/>
-            </w:tcBorders>
-            <w:shd w:val="clear" w:color="auto" w:fill="FFF9D6"/>
-            <w:tcMar>
-              <w:top w:w="100" w:type="dxa"/>
-              <w:left w:w="150" w:type="dxa"/>
-              <w:bottom w:w="100" w:type="dxa"/>
-              <w:right w:w="150" w:type="dxa"/>
-            </w:tcMar>
-            <w:vAlign w:val="center"/>
-          </w:tcPr>
-          <w:p>
-            <w:pPr>
-              <w:rPr>
-                <w:sz w:val="19"/>
-                <w:szCs w:val="19"/>
-              </w:rPr>
-            </w:pPr>
-            <w:r>
-              <w:rPr>
-                <w:sz w:val="19"/>
-                <w:szCs w:val="19"/>
-              </w:rPr>
-              <w:t>10</w:t>
-            </w:r>
-          </w:p>
-        </w:tc>
-        <w:tc>
-          <w:tcPr>
-            <w:tcW w:w="2200" w:type="dxa"/>
-            <w:tcBorders>
-              <w:top w:val="single" w:sz="4" w:space="0" w:color="D9D9D9"/>
-              <w:left w:val="single" w:sz="4" w:space="0" w:color="D9D9D9"/>
-              <w:bottom w:val="single" w:sz="4" w:space="0" w:color="D9D9D9"/>
-              <w:right w:val="single" w:sz="4" w:space="0" w:color="D9D9D9"/>
-            </w:tcBorders>
-            <w:shd w:val="clear" w:color="auto" w:fill="FFF9D6"/>
-            <w:tcMar>
-              <w:top w:w="100" w:type="dxa"/>
-              <w:left w:w="150" w:type="dxa"/>
-              <w:bottom w:w="100" w:type="dxa"/>
-              <w:right w:w="150" w:type="dxa"/>
-            </w:tcMar>
-            <w:vAlign w:val="center"/>
-          </w:tcPr>
-          <w:p>
-            <w:r>
-              <w:t>detalle_compra</w:t>
-            </w:r>
-          </w:p>
-        </w:tc>
-        <w:tc>
-          <w:tcPr>
-            <w:tcW w:w="2100" w:type="dxa"/>
-            <w:tcBorders>
-              <w:top w:val="single" w:sz="4" w:space="0" w:color="D9D9D9"/>
-              <w:left w:val="single" w:sz="4" w:space="0" w:color="D9D9D9"/>
-              <w:bottom w:val="single" w:sz="4" w:space="0" w:color="D9D9D9"/>
-              <w:right w:val="single" w:sz="4" w:space="0" w:color="D9D9D9"/>
-            </w:tcBorders>
-            <w:shd w:val="clear" w:color="auto" w:fill="FFF9D6"/>
-            <w:tcMar>
-              <w:top w:w="100" w:type="dxa"/>
-              <w:left w:w="150" w:type="dxa"/>
-              <w:bottom w:w="100" w:type="dxa"/>
-              <w:right w:w="150" w:type="dxa"/>
-            </w:tcMar>
-            <w:vAlign w:val="center"/>
-          </w:tcPr>
-          <w:p>
-            <w:r>
-              <w:t>débil</w:t>
-            </w:r>
-          </w:p>
-        </w:tc>
-        <w:tc>
-          <w:tcPr>
-            <w:tcW w:w="4026" w:type="dxa"/>
-            <w:tcBorders>
-              <w:top w:val="single" w:sz="4" w:space="0" w:color="D9D9D9"/>
-              <w:left w:val="single" w:sz="4" w:space="0" w:color="D9D9D9"/>
-              <w:bottom w:val="single" w:sz="4" w:space="0" w:color="D9D9D9"/>
-              <w:right w:val="single" w:sz="4" w:space="0" w:color="D9D9D9"/>
-            </w:tcBorders>
-            <w:shd w:val="clear" w:color="auto" w:fill="FFF9D6"/>
-            <w:tcMar>
-              <w:top w:w="100" w:type="dxa"/>
-              <w:left w:w="150" w:type="dxa"/>
-              <w:bottom w:w="100" w:type="dxa"/>
-              <w:right w:w="150" w:type="dxa"/>
-            </w:tcMar>
-            <w:vAlign w:val="center"/>
-          </w:tcPr>
-          <w:p>
-            <w:pPr>
-              <w:spacing w:before="240" w:after="120"/>
-              <w:rPr>
-                <w:sz w:val="22"/>
-                <w:szCs w:val="22"/>
-              </w:rPr>
-            </w:pPr>
-            <w:r>
-              <w:rPr>
-                <w:sz w:val="22"/>
-                <w:szCs w:val="22"/>
-              </w:rPr>
-              <w:t>Entidad intermedia entre</w:t>
-            </w:r>
-            <w:r>
-              <w:rPr>
-                <w:sz w:val="22"/>
-                <w:szCs w:val="22"/>
-              </w:rPr>
-              <w:t xml:space="preserve"> compra</w:t>
-            </w:r>
-            <w:r>
-              <w:rPr>
-                <w:sz w:val="22"/>
-                <w:szCs w:val="22"/>
-              </w:rPr>
-              <w:t xml:space="preserve"> </w:t>
-            </w:r>
-            <w:r>
-              <w:rPr>
-                <w:sz w:val="22"/>
-                <w:szCs w:val="22"/>
-              </w:rPr>
-              <w:t>y proveedor</w:t>
-            </w:r>
-            <w:r>
-              <w:rPr>
-                <w:sz w:val="22"/>
-                <w:szCs w:val="22"/>
-              </w:rPr>
-              <w:t>, especificando las cantidades y subtotales por cada ítem vendido.</w:t>
+              <w:t xml:space="preserve">Entidad intermedia entre compra y producto, especificando la cantidad, el precio unitario y el subtotal de cada ítem comprado.</w:t>
             </w:r>
           </w:p>
         </w:tc>
@@ -4145,17 +3923,7 @@
           <w:sz w:val="24"/>
           <w:szCs w:val="24"/>
         </w:rPr>
-        <w:t xml:space="preserve">4.2 </w:t>
-      </w:r>
-      <w:r>
-        <w:rPr>
-          <w:b/>
-          <w:bCs/>
-          <w:color w:val="2E75B6"/>
-          <w:sz w:val="24"/>
-          <w:szCs w:val="24"/>
-        </w:rPr>
-        <w:t>Atributos</w:t>
+        <w:t xml:space="preserve">4.2 Atributos</w:t>
       </w:r>
     </w:p>
     <w:p>
@@ -5049,7 +4817,7 @@
                 <w:b/>
                 <w:bCs/>
               </w:rPr>
-              <w:t>telefono1</w:t>
+              <w:t xml:space="preserve">telefono</w:t>
             </w:r>
           </w:p>
         </w:tc>
@@ -5142,7 +4910,7 @@
           </w:tcPr>
           <w:p>
             <w:r>
-              <w:t>NOT NULL</w:t>
+              <w:t xml:space="preserve">NOT NULL</w:t>
             </w:r>
           </w:p>
         </w:tc>
@@ -5160,7 +4928,7 @@
           </w:tcPr>
           <w:p>
             <w:r>
-              <w:t>Teléfono principal. Dígitos, con “+” inicial opcional.</w:t>
+              <w:t xml:space="preserve">Teléfono de contacto. Dígitos, con “+” inicial opcional.</w:t>
             </w:r>
           </w:p>
         </w:tc>
@@ -5196,7 +4964,7 @@
                 <w:b/>
                 <w:bCs/>
               </w:rPr>
-              <w:t>telefono2</w:t>
+              <w:t>mail</w:t>
             </w:r>
           </w:p>
         </w:tc>
@@ -5271,7 +5039,7 @@
           </w:tcPr>
           <w:p>
             <w:r>
-              <w:t>15 caracteres</w:t>
+              <w:t>100 caracteres</w:t>
             </w:r>
           </w:p>
         </w:tc>
@@ -5307,301 +5075,7 @@
           </w:tcPr>
           <w:p>
             <w:r>
-              <w:t>Teléfono alternativo. Dígitos, con “+” inicial opcional.</w:t>
-            </w:r>
-          </w:p>
-        </w:tc>
-      </w:tr>
-      <w:tr>
-        <w:tc>
-          <w:tcPr>
-            <w:tcW w:w="537" w:type="pct"/>
-            <w:tcBorders>
-              <w:top w:val="single" w:sz="4" w:space="0" w:color="D9D9D9"/>
-              <w:left w:val="single" w:sz="4" w:space="0" w:color="D9D9D9"/>
-              <w:bottom w:val="single" w:sz="4" w:space="0" w:color="D9D9D9"/>
-              <w:right w:val="single" w:sz="4" w:space="0" w:color="D9D9D9"/>
-            </w:tcBorders>
-            <w:shd w:val="clear" w:color="auto" w:fill="FFF9D6"/>
-            <w:tcMar>
-              <w:top w:w="100" w:type="dxa"/>
-              <w:left w:w="150" w:type="dxa"/>
-              <w:bottom w:w="100" w:type="dxa"/>
-              <w:right w:w="150" w:type="dxa"/>
-            </w:tcMar>
-            <w:vAlign w:val="center"/>
-          </w:tcPr>
-          <w:p>
-            <w:pPr>
-              <w:rPr>
-                <w:b/>
-                <w:bCs/>
-              </w:rPr>
-            </w:pPr>
-            <w:r>
-              <w:rPr>
-                <w:b/>
-                <w:bCs/>
-              </w:rPr>
-              <w:t>telefono3</w:t>
-            </w:r>
-          </w:p>
-        </w:tc>
-        <w:tc>
-          <w:tcPr>
-            <w:tcW w:w="589" w:type="pct"/>
-            <w:tcBorders>
-              <w:top w:val="single" w:sz="4" w:space="0" w:color="D9D9D9"/>
-              <w:left w:val="single" w:sz="4" w:space="0" w:color="D9D9D9"/>
-              <w:bottom w:val="single" w:sz="4" w:space="0" w:color="D9D9D9"/>
-              <w:right w:val="single" w:sz="4" w:space="0" w:color="D9D9D9"/>
-            </w:tcBorders>
-            <w:shd w:val="clear" w:color="auto" w:fill="FFF9D6"/>
-            <w:tcMar>
-              <w:top w:w="100" w:type="dxa"/>
-              <w:left w:w="150" w:type="dxa"/>
-              <w:bottom w:w="100" w:type="dxa"/>
-              <w:right w:w="150" w:type="dxa"/>
-            </w:tcMar>
-            <w:vAlign w:val="center"/>
-          </w:tcPr>
-          <w:p>
-            <w:pPr>
-              <w:rPr>
-                <w:b/>
-                <w:bCs/>
-              </w:rPr>
-            </w:pPr>
-          </w:p>
-        </w:tc>
-        <w:tc>
-          <w:tcPr>
-            <w:tcW w:w="555" w:type="pct"/>
-            <w:tcBorders>
-              <w:top w:val="single" w:sz="4" w:space="0" w:color="D9D9D9"/>
-              <w:left w:val="single" w:sz="4" w:space="0" w:color="D9D9D9"/>
-              <w:bottom w:val="single" w:sz="4" w:space="0" w:color="D9D9D9"/>
-              <w:right w:val="single" w:sz="4" w:space="0" w:color="D9D9D9"/>
-            </w:tcBorders>
-            <w:shd w:val="clear" w:color="auto" w:fill="FFF9D6"/>
-            <w:tcMar>
-              <w:top w:w="100" w:type="dxa"/>
-              <w:left w:w="150" w:type="dxa"/>
-              <w:bottom w:w="100" w:type="dxa"/>
-              <w:right w:w="150" w:type="dxa"/>
-            </w:tcMar>
-            <w:vAlign w:val="center"/>
-          </w:tcPr>
-          <w:p>
-            <w:r>
-              <w:t>VARCHAR</w:t>
-            </w:r>
-          </w:p>
-        </w:tc>
-        <w:tc>
-          <w:tcPr>
-            <w:tcW w:w="1106" w:type="pct"/>
-            <w:tcBorders>
-              <w:top w:val="single" w:sz="4" w:space="0" w:color="D9D9D9"/>
-              <w:left w:val="single" w:sz="4" w:space="0" w:color="D9D9D9"/>
-              <w:bottom w:val="single" w:sz="4" w:space="0" w:color="D9D9D9"/>
-              <w:right w:val="single" w:sz="4" w:space="0" w:color="D9D9D9"/>
-            </w:tcBorders>
-            <w:shd w:val="clear" w:color="auto" w:fill="FFF9D6"/>
-            <w:tcMar>
-              <w:top w:w="100" w:type="dxa"/>
-              <w:left w:w="150" w:type="dxa"/>
-              <w:bottom w:w="100" w:type="dxa"/>
-              <w:right w:w="150" w:type="dxa"/>
-            </w:tcMar>
-            <w:vAlign w:val="center"/>
-          </w:tcPr>
-          <w:p>
-            <w:r>
-              <w:t>15 caracteres</w:t>
-            </w:r>
-          </w:p>
-        </w:tc>
-        <w:tc>
-          <w:tcPr>
-            <w:tcW w:w="1106" w:type="pct"/>
-            <w:tcBorders>
-              <w:top w:val="single" w:sz="4" w:space="0" w:color="D9D9D9"/>
-              <w:left w:val="single" w:sz="4" w:space="0" w:color="D9D9D9"/>
-              <w:bottom w:val="single" w:sz="4" w:space="0" w:color="D9D9D9"/>
-              <w:right w:val="single" w:sz="4" w:space="0" w:color="D9D9D9"/>
-            </w:tcBorders>
-            <w:shd w:val="clear" w:color="auto" w:fill="FFF9D6"/>
-            <w:vAlign w:val="center"/>
-          </w:tcPr>
-          <w:p>
-            <w:r>
-              <w:t>NULL</w:t>
-            </w:r>
-          </w:p>
-        </w:tc>
-        <w:tc>
-          <w:tcPr>
-            <w:tcW w:w="1106" w:type="pct"/>
-            <w:tcBorders>
-              <w:top w:val="single" w:sz="4" w:space="0" w:color="D9D9D9"/>
-              <w:left w:val="single" w:sz="4" w:space="0" w:color="D9D9D9"/>
-              <w:bottom w:val="single" w:sz="4" w:space="0" w:color="D9D9D9"/>
-              <w:right w:val="single" w:sz="4" w:space="0" w:color="D9D9D9"/>
-            </w:tcBorders>
-            <w:shd w:val="clear" w:color="auto" w:fill="FFF9D6"/>
-            <w:vAlign w:val="center"/>
-          </w:tcPr>
-          <w:p>
-            <w:r>
-              <w:t>Teléfono alternativo adicional. Dígitos, con “+” inicial opcional.</w:t>
-            </w:r>
-          </w:p>
-        </w:tc>
-      </w:tr>
-      <w:tr>
-        <w:tc>
-          <w:tcPr>
-            <w:tcW w:w="537" w:type="pct"/>
-            <w:tcBorders>
-              <w:top w:val="single" w:sz="4" w:space="0" w:color="D9D9D9"/>
-              <w:left w:val="single" w:sz="4" w:space="0" w:color="D9D9D9"/>
-              <w:bottom w:val="single" w:sz="4" w:space="0" w:color="D9D9D9"/>
-              <w:right w:val="single" w:sz="4" w:space="0" w:color="D9D9D9"/>
-            </w:tcBorders>
-            <w:shd w:val="clear" w:color="auto" w:fill="FFF9D6"/>
-            <w:tcMar>
-              <w:top w:w="100" w:type="dxa"/>
-              <w:left w:w="150" w:type="dxa"/>
-              <w:bottom w:w="100" w:type="dxa"/>
-              <w:right w:w="150" w:type="dxa"/>
-            </w:tcMar>
-            <w:vAlign w:val="center"/>
-          </w:tcPr>
-          <w:p>
-            <w:pPr>
-              <w:rPr>
-                <w:b/>
-                <w:bCs/>
-              </w:rPr>
-            </w:pPr>
-            <w:r>
-              <w:rPr>
-                <w:b/>
-                <w:bCs/>
-              </w:rPr>
-              <w:t>mail</w:t>
-            </w:r>
-          </w:p>
-        </w:tc>
-        <w:tc>
-          <w:tcPr>
-            <w:tcW w:w="589" w:type="pct"/>
-            <w:tcBorders>
-              <w:top w:val="single" w:sz="4" w:space="0" w:color="D9D9D9"/>
-              <w:left w:val="single" w:sz="4" w:space="0" w:color="D9D9D9"/>
-              <w:bottom w:val="single" w:sz="4" w:space="0" w:color="D9D9D9"/>
-              <w:right w:val="single" w:sz="4" w:space="0" w:color="D9D9D9"/>
-            </w:tcBorders>
-            <w:shd w:val="clear" w:color="auto" w:fill="FFF9D6"/>
-            <w:tcMar>
-              <w:top w:w="100" w:type="dxa"/>
-              <w:left w:w="150" w:type="dxa"/>
-              <w:bottom w:w="100" w:type="dxa"/>
-              <w:right w:w="150" w:type="dxa"/>
-            </w:tcMar>
-            <w:vAlign w:val="center"/>
-          </w:tcPr>
-          <w:p>
-            <w:pPr>
-              <w:rPr>
-                <w:b/>
-                <w:bCs/>
-              </w:rPr>
-            </w:pPr>
-          </w:p>
-        </w:tc>
-        <w:tc>
-          <w:tcPr>
-            <w:tcW w:w="555" w:type="pct"/>
-            <w:tcBorders>
-              <w:top w:val="single" w:sz="4" w:space="0" w:color="D9D9D9"/>
-              <w:left w:val="single" w:sz="4" w:space="0" w:color="D9D9D9"/>
-              <w:bottom w:val="single" w:sz="4" w:space="0" w:color="D9D9D9"/>
-              <w:right w:val="single" w:sz="4" w:space="0" w:color="D9D9D9"/>
-            </w:tcBorders>
-            <w:shd w:val="clear" w:color="auto" w:fill="FFF9D6"/>
-            <w:tcMar>
-              <w:top w:w="100" w:type="dxa"/>
-              <w:left w:w="150" w:type="dxa"/>
-              <w:bottom w:w="100" w:type="dxa"/>
-              <w:right w:w="150" w:type="dxa"/>
-            </w:tcMar>
-            <w:vAlign w:val="center"/>
-          </w:tcPr>
-          <w:p>
-            <w:r>
-              <w:t>VARCHAR</w:t>
-            </w:r>
-          </w:p>
-        </w:tc>
-        <w:tc>
-          <w:tcPr>
-            <w:tcW w:w="1106" w:type="pct"/>
-            <w:tcBorders>
-              <w:top w:val="single" w:sz="4" w:space="0" w:color="D9D9D9"/>
-              <w:left w:val="single" w:sz="4" w:space="0" w:color="D9D9D9"/>
-              <w:bottom w:val="single" w:sz="4" w:space="0" w:color="D9D9D9"/>
-              <w:right w:val="single" w:sz="4" w:space="0" w:color="D9D9D9"/>
-            </w:tcBorders>
-            <w:shd w:val="clear" w:color="auto" w:fill="FFF9D6"/>
-            <w:tcMar>
-              <w:top w:w="100" w:type="dxa"/>
-              <w:left w:w="150" w:type="dxa"/>
-              <w:bottom w:w="100" w:type="dxa"/>
-              <w:right w:w="150" w:type="dxa"/>
-            </w:tcMar>
-            <w:vAlign w:val="center"/>
-          </w:tcPr>
-          <w:p>
-            <w:r>
-              <w:t>100 caracteres</w:t>
-            </w:r>
-          </w:p>
-        </w:tc>
-        <w:tc>
-          <w:tcPr>
-            <w:tcW w:w="1106" w:type="pct"/>
-            <w:tcBorders>
-              <w:top w:val="single" w:sz="4" w:space="0" w:color="D9D9D9"/>
-              <w:left w:val="single" w:sz="4" w:space="0" w:color="D9D9D9"/>
-              <w:bottom w:val="single" w:sz="4" w:space="0" w:color="D9D9D9"/>
-              <w:right w:val="single" w:sz="4" w:space="0" w:color="D9D9D9"/>
-            </w:tcBorders>
-            <w:shd w:val="clear" w:color="auto" w:fill="FFF9D6"/>
-            <w:vAlign w:val="center"/>
-          </w:tcPr>
-          <w:p>
-            <w:r>
-              <w:t>NULL</w:t>
-            </w:r>
-          </w:p>
-        </w:tc>
-        <w:tc>
-          <w:tcPr>
-            <w:tcW w:w="1106" w:type="pct"/>
-            <w:tcBorders>
-              <w:top w:val="single" w:sz="4" w:space="0" w:color="D9D9D9"/>
-              <w:left w:val="single" w:sz="4" w:space="0" w:color="D9D9D9"/>
-              <w:bottom w:val="single" w:sz="4" w:space="0" w:color="D9D9D9"/>
-              <w:right w:val="single" w:sz="4" w:space="0" w:color="D9D9D9"/>
-            </w:tcBorders>
-            <w:shd w:val="clear" w:color="auto" w:fill="FFF9D6"/>
-            <w:vAlign w:val="center"/>
-          </w:tcPr>
-          <w:p>
-            <w:r>
-              <w:t>Dirección de correo electrónico.</w:t>
+              <w:t xml:space="preserve">Dirección de correo electrónico (con “@” y dominio).</w:t>
             </w:r>
           </w:p>
         </w:tc>
@@ -5772,16 +5246,7 @@
           <w:sz w:val="24"/>
           <w:szCs w:val="24"/>
         </w:rPr>
-        <w:t xml:space="preserve">Tabla </w:t>
-      </w:r>
-      <w:r>
-        <w:rPr>
-          <w:b/>
-          <w:bCs/>
-          <w:sz w:val="24"/>
-          <w:szCs w:val="24"/>
-        </w:rPr>
-        <w:t>cliente</w:t>
+        <w:t xml:space="preserve">Tabla cliente</w:t>
       </w:r>
     </w:p>
     <w:tbl>
@@ -6717,7 +6182,7 @@
                 <w:sz w:val="19"/>
                 <w:szCs w:val="19"/>
               </w:rPr>
-              <w:t>Solo dígitos, sin puntos ni espacios. No se repite entre clientes.</w:t>
+              <w:t xml:space="preserve">Dígitos y letras, sin puntos ni espacios (admite pasaportes y documentos extranjeros). No se repite entre clientes.</w:t>
             </w:r>
           </w:p>
         </w:tc>
@@ -6887,23 +6352,7 @@
                 <w:sz w:val="19"/>
                 <w:szCs w:val="19"/>
               </w:rPr>
-              <w:t>Teléfono de contacto. Dígitos, con “+” inicial opcional</w:t>
-            </w:r>
-            <w:r>
-              <w:rPr>
-                <w:color w:val="000000"/>
-                <w:sz w:val="19"/>
-                <w:szCs w:val="19"/>
-              </w:rPr>
-              <w:t>.</w:t>
-            </w:r>
-            <w:r>
-              <w:rPr>
-                <w:color w:val="000000"/>
-                <w:sz w:val="19"/>
-                <w:szCs w:val="19"/>
-              </w:rPr>
-              <w:t xml:space="preserve"> </w:t>
+              <w:t xml:space="preserve">Teléfono de contacto. Dígitos, con “+” inicial opcional. </w:t>
             </w:r>
           </w:p>
         </w:tc>
@@ -6926,16 +6375,7 @@
           <w:sz w:val="24"/>
           <w:szCs w:val="24"/>
         </w:rPr>
-        <w:t xml:space="preserve">Tabla </w:t>
-      </w:r>
-      <w:r>
-        <w:rPr>
-          <w:b/>
-          <w:bCs/>
-          <w:sz w:val="24"/>
-          <w:szCs w:val="24"/>
-        </w:rPr>
-        <w:t>proveedor</w:t>
+        <w:t xml:space="preserve">Tabla proveedor</w:t>
       </w:r>
     </w:p>
     <w:tbl>
@@ -7701,7 +7141,7 @@
                 <w:sz w:val="19"/>
                 <w:szCs w:val="19"/>
               </w:rPr>
-              <w:t>Formato 11 dígitos. No se repite entre proveedores.</w:t>
+              <w:t xml:space="preserve">Exactamente 11 dígitos, sin guiones. No se repite entre proveedores.</w:t>
             </w:r>
           </w:p>
         </w:tc>
@@ -7740,7 +7180,7 @@
                 <w:sz w:val="19"/>
                 <w:szCs w:val="19"/>
               </w:rPr>
-              <w:t>telefono1</w:t>
+              <w:t xml:space="preserve">telefono</w:t>
             </w:r>
           </w:p>
         </w:tc>
@@ -7848,7 +7288,7 @@
                 <w:sz w:val="19"/>
                 <w:szCs w:val="19"/>
               </w:rPr>
-              <w:t>NOT NULL</w:t>
+              <w:t xml:space="preserve">NOT NULL</w:t>
             </w:r>
           </w:p>
         </w:tc>
@@ -7871,348 +7311,7 @@
                 <w:sz w:val="19"/>
                 <w:szCs w:val="19"/>
               </w:rPr>
-              <w:t>Teléfono principal. Dígitos, con “+” inicial opcional.</w:t>
-            </w:r>
-          </w:p>
-        </w:tc>
-      </w:tr>
-      <w:tr>
-        <w:tc>
-          <w:tcPr>
-            <w:tcW w:w="945" w:type="pct"/>
-            <w:tcBorders>
-              <w:top w:val="single" w:sz="4" w:space="0" w:color="D9D9D9"/>
-              <w:left w:val="single" w:sz="4" w:space="0" w:color="D9D9D9"/>
-              <w:bottom w:val="single" w:sz="4" w:space="0" w:color="D9D9D9"/>
-              <w:right w:val="single" w:sz="4" w:space="0" w:color="D9D9D9"/>
-            </w:tcBorders>
-            <w:shd w:val="clear" w:color="auto" w:fill="FFF9D6"/>
-            <w:tcMar>
-              <w:top w:w="100" w:type="dxa"/>
-              <w:left w:w="150" w:type="dxa"/>
-              <w:bottom w:w="100" w:type="dxa"/>
-              <w:right w:w="150" w:type="dxa"/>
-            </w:tcMar>
-            <w:vAlign w:val="center"/>
-          </w:tcPr>
-          <w:p>
-            <w:pPr>
-              <w:rPr>
-                <w:b/>
-                <w:bCs/>
-              </w:rPr>
-            </w:pPr>
-            <w:r>
-              <w:rPr>
-                <w:b/>
-                <w:bCs/>
-                <w:color w:val="000000"/>
-                <w:sz w:val="19"/>
-                <w:szCs w:val="19"/>
-              </w:rPr>
-              <w:t>telefono2</w:t>
-            </w:r>
-          </w:p>
-        </w:tc>
-        <w:tc>
-          <w:tcPr>
-            <w:tcW w:w="477" w:type="pct"/>
-            <w:tcBorders>
-              <w:top w:val="single" w:sz="4" w:space="0" w:color="D9D9D9"/>
-              <w:left w:val="single" w:sz="4" w:space="0" w:color="D9D9D9"/>
-              <w:bottom w:val="single" w:sz="4" w:space="0" w:color="D9D9D9"/>
-              <w:right w:val="single" w:sz="4" w:space="0" w:color="D9D9D9"/>
-            </w:tcBorders>
-            <w:shd w:val="clear" w:color="auto" w:fill="FFF9D6"/>
-            <w:tcMar>
-              <w:top w:w="100" w:type="dxa"/>
-              <w:left w:w="150" w:type="dxa"/>
-              <w:bottom w:w="100" w:type="dxa"/>
-              <w:right w:w="150" w:type="dxa"/>
-            </w:tcMar>
-            <w:vAlign w:val="center"/>
-          </w:tcPr>
-          <w:p>
-            <w:pPr>
-              <w:rPr>
-                <w:b/>
-                <w:bCs/>
-              </w:rPr>
-            </w:pPr>
-          </w:p>
-        </w:tc>
-        <w:tc>
-          <w:tcPr>
-            <w:tcW w:w="596" w:type="pct"/>
-            <w:tcBorders>
-              <w:top w:val="single" w:sz="4" w:space="0" w:color="D9D9D9"/>
-              <w:left w:val="single" w:sz="4" w:space="0" w:color="D9D9D9"/>
-              <w:bottom w:val="single" w:sz="4" w:space="0" w:color="D9D9D9"/>
-              <w:right w:val="single" w:sz="4" w:space="0" w:color="D9D9D9"/>
-            </w:tcBorders>
-            <w:shd w:val="clear" w:color="auto" w:fill="FFF9D6"/>
-            <w:tcMar>
-              <w:top w:w="100" w:type="dxa"/>
-              <w:left w:w="150" w:type="dxa"/>
-              <w:bottom w:w="100" w:type="dxa"/>
-              <w:right w:w="150" w:type="dxa"/>
-            </w:tcMar>
-            <w:vAlign w:val="center"/>
-          </w:tcPr>
-          <w:p>
-            <w:r>
-              <w:rPr>
-                <w:color w:val="000000"/>
-                <w:sz w:val="19"/>
-                <w:szCs w:val="19"/>
-              </w:rPr>
-              <w:t>VARCHAR</w:t>
-            </w:r>
-          </w:p>
-        </w:tc>
-        <w:tc>
-          <w:tcPr>
-            <w:tcW w:w="994" w:type="pct"/>
-            <w:tcBorders>
-              <w:top w:val="single" w:sz="4" w:space="0" w:color="D9D9D9"/>
-              <w:left w:val="single" w:sz="4" w:space="0" w:color="D9D9D9"/>
-              <w:bottom w:val="single" w:sz="4" w:space="0" w:color="D9D9D9"/>
-              <w:right w:val="single" w:sz="4" w:space="0" w:color="D9D9D9"/>
-            </w:tcBorders>
-            <w:shd w:val="clear" w:color="auto" w:fill="FFF9D6"/>
-            <w:tcMar>
-              <w:top w:w="100" w:type="dxa"/>
-              <w:left w:w="150" w:type="dxa"/>
-              <w:bottom w:w="100" w:type="dxa"/>
-              <w:right w:w="150" w:type="dxa"/>
-            </w:tcMar>
-            <w:vAlign w:val="center"/>
-          </w:tcPr>
-          <w:p>
-            <w:r>
-              <w:rPr>
-                <w:color w:val="000000"/>
-                <w:sz w:val="19"/>
-                <w:szCs w:val="19"/>
-              </w:rPr>
-              <w:t>15 caracteres</w:t>
-            </w:r>
-          </w:p>
-        </w:tc>
-        <w:tc>
-          <w:tcPr>
-            <w:tcW w:w="994" w:type="pct"/>
-            <w:tcBorders>
-              <w:top w:val="single" w:sz="4" w:space="0" w:color="D9D9D9"/>
-              <w:left w:val="single" w:sz="4" w:space="0" w:color="D9D9D9"/>
-              <w:bottom w:val="single" w:sz="4" w:space="0" w:color="D9D9D9"/>
-              <w:right w:val="single" w:sz="4" w:space="0" w:color="D9D9D9"/>
-            </w:tcBorders>
-            <w:shd w:val="clear" w:color="auto" w:fill="FFF9D6"/>
-            <w:vAlign w:val="center"/>
-          </w:tcPr>
-          <w:p>
-            <w:r>
-              <w:rPr>
-                <w:color w:val="000000"/>
-                <w:sz w:val="19"/>
-                <w:szCs w:val="19"/>
-              </w:rPr>
-              <w:t>NULL</w:t>
-            </w:r>
-          </w:p>
-        </w:tc>
-        <w:tc>
-          <w:tcPr>
-            <w:tcW w:w="994" w:type="pct"/>
-            <w:tcBorders>
-              <w:top w:val="single" w:sz="4" w:space="0" w:color="D9D9D9"/>
-              <w:left w:val="single" w:sz="4" w:space="0" w:color="D9D9D9"/>
-              <w:bottom w:val="single" w:sz="4" w:space="0" w:color="D9D9D9"/>
-              <w:right w:val="single" w:sz="4" w:space="0" w:color="D9D9D9"/>
-            </w:tcBorders>
-            <w:shd w:val="clear" w:color="auto" w:fill="FFF9D6"/>
-            <w:vAlign w:val="center"/>
-          </w:tcPr>
-          <w:p>
-            <w:r>
-              <w:rPr>
-                <w:color w:val="000000"/>
-                <w:sz w:val="19"/>
-                <w:szCs w:val="19"/>
-              </w:rPr>
-              <w:t>Teléfono alternativo. Dígitos, con “+” inicial opcional.</w:t>
-            </w:r>
-          </w:p>
-        </w:tc>
-      </w:tr>
-      <w:tr>
-        <w:tc>
-          <w:tcPr>
-            <w:tcW w:w="945" w:type="pct"/>
-            <w:tcBorders>
-              <w:top w:val="single" w:sz="4" w:space="0" w:color="D9D9D9"/>
-              <w:left w:val="single" w:sz="4" w:space="0" w:color="D9D9D9"/>
-              <w:bottom w:val="single" w:sz="4" w:space="0" w:color="D9D9D9"/>
-              <w:right w:val="single" w:sz="4" w:space="0" w:color="D9D9D9"/>
-            </w:tcBorders>
-            <w:shd w:val="clear" w:color="auto" w:fill="FFF9D6"/>
-            <w:tcMar>
-              <w:top w:w="100" w:type="dxa"/>
-              <w:left w:w="150" w:type="dxa"/>
-              <w:bottom w:w="100" w:type="dxa"/>
-              <w:right w:w="150" w:type="dxa"/>
-            </w:tcMar>
-            <w:vAlign w:val="center"/>
-          </w:tcPr>
-          <w:p>
-            <w:pPr>
-              <w:rPr>
-                <w:b/>
-                <w:bCs/>
-              </w:rPr>
-            </w:pPr>
-            <w:r>
-              <w:rPr>
-                <w:b/>
-                <w:bCs/>
-                <w:color w:val="000000"/>
-                <w:sz w:val="19"/>
-                <w:szCs w:val="19"/>
-              </w:rPr>
-              <w:lastRenderedPageBreak/>
-              <w:t>telefono3</w:t>
-            </w:r>
-          </w:p>
-        </w:tc>
-        <w:tc>
-          <w:tcPr>
-            <w:tcW w:w="477" w:type="pct"/>
-            <w:tcBorders>
-              <w:top w:val="single" w:sz="4" w:space="0" w:color="D9D9D9"/>
-              <w:left w:val="single" w:sz="4" w:space="0" w:color="D9D9D9"/>
-              <w:bottom w:val="single" w:sz="4" w:space="0" w:color="D9D9D9"/>
-              <w:right w:val="single" w:sz="4" w:space="0" w:color="D9D9D9"/>
-            </w:tcBorders>
-            <w:shd w:val="clear" w:color="auto" w:fill="FFF9D6"/>
-            <w:tcMar>
-              <w:top w:w="100" w:type="dxa"/>
-              <w:left w:w="150" w:type="dxa"/>
-              <w:bottom w:w="100" w:type="dxa"/>
-              <w:right w:w="150" w:type="dxa"/>
-            </w:tcMar>
-            <w:vAlign w:val="center"/>
-          </w:tcPr>
-          <w:p>
-            <w:pPr>
-              <w:rPr>
-                <w:b/>
-                <w:bCs/>
-              </w:rPr>
-            </w:pPr>
-          </w:p>
-        </w:tc>
-        <w:tc>
-          <w:tcPr>
-            <w:tcW w:w="596" w:type="pct"/>
-            <w:tcBorders>
-              <w:top w:val="single" w:sz="4" w:space="0" w:color="D9D9D9"/>
-              <w:left w:val="single" w:sz="4" w:space="0" w:color="D9D9D9"/>
-              <w:bottom w:val="single" w:sz="4" w:space="0" w:color="D9D9D9"/>
-              <w:right w:val="single" w:sz="4" w:space="0" w:color="D9D9D9"/>
-            </w:tcBorders>
-            <w:shd w:val="clear" w:color="auto" w:fill="FFF9D6"/>
-            <w:tcMar>
-              <w:top w:w="100" w:type="dxa"/>
-              <w:left w:w="150" w:type="dxa"/>
-              <w:bottom w:w="100" w:type="dxa"/>
-              <w:right w:w="150" w:type="dxa"/>
-            </w:tcMar>
-            <w:vAlign w:val="center"/>
-          </w:tcPr>
-          <w:p>
-            <w:r>
-              <w:rPr>
-                <w:color w:val="000000"/>
-                <w:sz w:val="19"/>
-                <w:szCs w:val="19"/>
-              </w:rPr>
-              <w:t>VARCHAR</w:t>
-            </w:r>
-          </w:p>
-        </w:tc>
-        <w:tc>
-          <w:tcPr>
-            <w:tcW w:w="994" w:type="pct"/>
-            <w:tcBorders>
-              <w:top w:val="single" w:sz="4" w:space="0" w:color="D9D9D9"/>
-              <w:left w:val="single" w:sz="4" w:space="0" w:color="D9D9D9"/>
-              <w:bottom w:val="single" w:sz="4" w:space="0" w:color="D9D9D9"/>
-              <w:right w:val="single" w:sz="4" w:space="0" w:color="D9D9D9"/>
-            </w:tcBorders>
-            <w:shd w:val="clear" w:color="auto" w:fill="FFF9D6"/>
-            <w:tcMar>
-              <w:top w:w="100" w:type="dxa"/>
-              <w:left w:w="150" w:type="dxa"/>
-              <w:bottom w:w="100" w:type="dxa"/>
-              <w:right w:w="150" w:type="dxa"/>
-            </w:tcMar>
-            <w:vAlign w:val="center"/>
-          </w:tcPr>
-          <w:p>
-            <w:r>
-              <w:rPr>
-                <w:color w:val="000000"/>
-                <w:sz w:val="19"/>
-                <w:szCs w:val="19"/>
-              </w:rPr>
-              <w:t>15 caracteres</w:t>
-            </w:r>
-          </w:p>
-        </w:tc>
-        <w:tc>
-          <w:tcPr>
-            <w:tcW w:w="994" w:type="pct"/>
-            <w:tcBorders>
-              <w:top w:val="single" w:sz="4" w:space="0" w:color="D9D9D9"/>
-              <w:left w:val="single" w:sz="4" w:space="0" w:color="D9D9D9"/>
-              <w:bottom w:val="single" w:sz="4" w:space="0" w:color="D9D9D9"/>
-              <w:right w:val="single" w:sz="4" w:space="0" w:color="D9D9D9"/>
-            </w:tcBorders>
-            <w:shd w:val="clear" w:color="auto" w:fill="FFF9D6"/>
-            <w:vAlign w:val="center"/>
-          </w:tcPr>
-          <w:p>
-            <w:r>
-              <w:rPr>
-                <w:color w:val="000000"/>
-                <w:sz w:val="19"/>
-                <w:szCs w:val="19"/>
-              </w:rPr>
-              <w:t>NULL</w:t>
-            </w:r>
-          </w:p>
-        </w:tc>
-        <w:tc>
-          <w:tcPr>
-            <w:tcW w:w="994" w:type="pct"/>
-            <w:tcBorders>
-              <w:top w:val="single" w:sz="4" w:space="0" w:color="D9D9D9"/>
-              <w:left w:val="single" w:sz="4" w:space="0" w:color="D9D9D9"/>
-              <w:bottom w:val="single" w:sz="4" w:space="0" w:color="D9D9D9"/>
-              <w:right w:val="single" w:sz="4" w:space="0" w:color="D9D9D9"/>
-            </w:tcBorders>
-            <w:shd w:val="clear" w:color="auto" w:fill="FFF9D6"/>
-            <w:vAlign w:val="center"/>
-          </w:tcPr>
-          <w:p>
-            <w:r>
-              <w:rPr>
-                <w:color w:val="000000"/>
-                <w:sz w:val="19"/>
-                <w:szCs w:val="19"/>
-              </w:rPr>
-              <w:t>Teléfono alternativo adicional. Dígitos, con “+” inicial opcional.</w:t>
+              <w:t xml:space="preserve">Teléfono de contacto. Dígitos, con “+” inicial opcional.</w:t>
             </w:r>
           </w:p>
         </w:tc>
@@ -8235,16 +7334,7 @@
           <w:sz w:val="24"/>
           <w:szCs w:val="24"/>
         </w:rPr>
-        <w:t xml:space="preserve">Tabla </w:t>
-      </w:r>
-      <w:r>
-        <w:rPr>
-          <w:b/>
-          <w:bCs/>
-          <w:sz w:val="24"/>
-          <w:szCs w:val="24"/>
-        </w:rPr>
-        <w:t>inventario</w:t>
+        <w:t xml:space="preserve">Tabla producto</w:t>
       </w:r>
     </w:p>
     <w:tbl>
@@ -8507,7 +7597,7 @@
                 <w:sz w:val="19"/>
                 <w:szCs w:val="19"/>
               </w:rPr>
-              <w:t>id_inventario</w:t>
+              <w:t xml:space="preserve">id_producto</w:t>
             </w:r>
           </w:p>
         </w:tc>
@@ -8660,7 +7750,7 @@
                 <w:sz w:val="19"/>
                 <w:szCs w:val="19"/>
               </w:rPr>
-              <w:t>Entero positivo autoincremental. Identifica de forma única el ítem.</w:t>
+              <w:t xml:space="preserve">Entero positivo autoincremental. Identifica de forma única el producto.</w:t>
             </w:r>
           </w:p>
         </w:tc>
@@ -8830,7 +7920,7 @@
                 <w:sz w:val="19"/>
                 <w:szCs w:val="19"/>
               </w:rPr>
-              <w:t>Entero mayor o igual a 0. Unidades disponibles (valor por defecto: 0).</w:t>
+              <w:t xml:space="preserve">Entero mayor o igual a 0. Unidades disponibles (valor por defecto: 0). Lo actualiza la base con cada compra y venta.</w:t>
             </w:r>
           </w:p>
         </w:tc>
@@ -8869,7 +7959,7 @@
                 <w:sz w:val="19"/>
                 <w:szCs w:val="19"/>
               </w:rPr>
-              <w:t>precio_compra</w:t>
+              <w:t xml:space="preserve">stock_minimo</w:t>
             </w:r>
           </w:p>
         </w:tc>
@@ -8898,6 +7988,16 @@
                 <w:bCs/>
               </w:rPr>
             </w:pPr>
+            <w:r>
+              <w:rPr>
+                <w:b/>
+                <w:bCs/>
+                <w:color w:val="000000"/>
+                <w:sz w:val="19"/>
+                <w:szCs w:val="19"/>
+              </w:rPr>
+              <w:t xml:space="preserve"/>
+            </w:r>
           </w:p>
         </w:tc>
         <w:tc>
@@ -8925,7 +8025,7 @@
                 <w:sz w:val="19"/>
                 <w:szCs w:val="19"/>
               </w:rPr>
-              <w:t>DECIMAL</w:t>
+              <w:t xml:space="preserve">INT</w:t>
             </w:r>
           </w:p>
         </w:tc>
@@ -8954,7 +8054,7 @@
                 <w:sz w:val="19"/>
                 <w:szCs w:val="19"/>
               </w:rPr>
-              <w:t>10 dígitos (2 decimales)</w:t>
+              <w:t xml:space="preserve">4 bytes</w:t>
             </w:r>
           </w:p>
         </w:tc>
@@ -8977,7 +8077,7 @@
                 <w:sz w:val="19"/>
                 <w:szCs w:val="19"/>
               </w:rPr>
-              <w:t>NOT NULL</w:t>
+              <w:t xml:space="preserve">NOT NULL</w:t>
             </w:r>
           </w:p>
         </w:tc>
@@ -9000,7 +8100,7 @@
                 <w:sz w:val="19"/>
                 <w:szCs w:val="19"/>
               </w:rPr>
-              <w:t>Número decimal mayor o igual a 0. Costo de adquisición por unidad.</w:t>
+              <w:t xml:space="preserve">Entero mayor o igual a 0 (valor por defecto: 0). Si el stock queda por debajo, el producto aparece en la alerta de stock crítico.</w:t>
             </w:r>
           </w:p>
         </w:tc>
@@ -9039,6 +8139,176 @@
                 <w:sz w:val="19"/>
                 <w:szCs w:val="19"/>
               </w:rPr>
+              <w:t>precio_compra</w:t>
+            </w:r>
+          </w:p>
+        </w:tc>
+        <w:tc>
+          <w:tcPr>
+            <w:tcW w:w="500" w:type="pct"/>
+            <w:tcBorders>
+              <w:top w:val="single" w:sz="4" w:space="0" w:color="D9D9D9"/>
+              <w:left w:val="single" w:sz="4" w:space="0" w:color="D9D9D9"/>
+              <w:bottom w:val="single" w:sz="4" w:space="0" w:color="D9D9D9"/>
+              <w:right w:val="single" w:sz="4" w:space="0" w:color="D9D9D9"/>
+            </w:tcBorders>
+            <w:shd w:val="clear" w:color="auto" w:fill="FFF9D6"/>
+            <w:tcMar>
+              <w:top w:w="100" w:type="dxa"/>
+              <w:left w:w="150" w:type="dxa"/>
+              <w:bottom w:w="100" w:type="dxa"/>
+              <w:right w:w="150" w:type="dxa"/>
+            </w:tcMar>
+            <w:vAlign w:val="center"/>
+          </w:tcPr>
+          <w:p>
+            <w:pPr>
+              <w:rPr>
+                <w:b/>
+                <w:bCs/>
+              </w:rPr>
+            </w:pPr>
+          </w:p>
+        </w:tc>
+        <w:tc>
+          <w:tcPr>
+            <w:tcW w:w="619" w:type="pct"/>
+            <w:tcBorders>
+              <w:top w:val="single" w:sz="4" w:space="0" w:color="D9D9D9"/>
+              <w:left w:val="single" w:sz="4" w:space="0" w:color="D9D9D9"/>
+              <w:bottom w:val="single" w:sz="4" w:space="0" w:color="D9D9D9"/>
+              <w:right w:val="single" w:sz="4" w:space="0" w:color="D9D9D9"/>
+            </w:tcBorders>
+            <w:shd w:val="clear" w:color="auto" w:fill="FFF9D6"/>
+            <w:tcMar>
+              <w:top w:w="100" w:type="dxa"/>
+              <w:left w:w="150" w:type="dxa"/>
+              <w:bottom w:w="100" w:type="dxa"/>
+              <w:right w:w="150" w:type="dxa"/>
+            </w:tcMar>
+            <w:vAlign w:val="center"/>
+          </w:tcPr>
+          <w:p>
+            <w:r>
+              <w:rPr>
+                <w:color w:val="000000"/>
+                <w:sz w:val="19"/>
+                <w:szCs w:val="19"/>
+              </w:rPr>
+              <w:t>DECIMAL</w:t>
+            </w:r>
+          </w:p>
+        </w:tc>
+        <w:tc>
+          <w:tcPr>
+            <w:tcW w:w="1017" w:type="pct"/>
+            <w:tcBorders>
+              <w:top w:val="single" w:sz="4" w:space="0" w:color="D9D9D9"/>
+              <w:left w:val="single" w:sz="4" w:space="0" w:color="D9D9D9"/>
+              <w:bottom w:val="single" w:sz="4" w:space="0" w:color="D9D9D9"/>
+              <w:right w:val="single" w:sz="4" w:space="0" w:color="D9D9D9"/>
+            </w:tcBorders>
+            <w:shd w:val="clear" w:color="auto" w:fill="FFF9D6"/>
+            <w:tcMar>
+              <w:top w:w="100" w:type="dxa"/>
+              <w:left w:w="150" w:type="dxa"/>
+              <w:bottom w:w="100" w:type="dxa"/>
+              <w:right w:w="150" w:type="dxa"/>
+            </w:tcMar>
+            <w:vAlign w:val="center"/>
+          </w:tcPr>
+          <w:p>
+            <w:r>
+              <w:rPr>
+                <w:color w:val="000000"/>
+                <w:sz w:val="19"/>
+                <w:szCs w:val="19"/>
+              </w:rPr>
+              <w:t>10 dígitos (2 decimales)</w:t>
+            </w:r>
+          </w:p>
+        </w:tc>
+        <w:tc>
+          <w:tcPr>
+            <w:tcW w:w="1017" w:type="pct"/>
+            <w:tcBorders>
+              <w:top w:val="single" w:sz="4" w:space="0" w:color="D9D9D9"/>
+              <w:left w:val="single" w:sz="4" w:space="0" w:color="D9D9D9"/>
+              <w:bottom w:val="single" w:sz="4" w:space="0" w:color="D9D9D9"/>
+              <w:right w:val="single" w:sz="4" w:space="0" w:color="D9D9D9"/>
+            </w:tcBorders>
+            <w:shd w:val="clear" w:color="auto" w:fill="FFF9D6"/>
+            <w:vAlign w:val="center"/>
+          </w:tcPr>
+          <w:p>
+            <w:r>
+              <w:rPr>
+                <w:color w:val="000000"/>
+                <w:sz w:val="19"/>
+                <w:szCs w:val="19"/>
+              </w:rPr>
+              <w:t>NOT NULL</w:t>
+            </w:r>
+          </w:p>
+        </w:tc>
+        <w:tc>
+          <w:tcPr>
+            <w:tcW w:w="1018" w:type="pct"/>
+            <w:tcBorders>
+              <w:top w:val="single" w:sz="4" w:space="0" w:color="D9D9D9"/>
+              <w:left w:val="single" w:sz="4" w:space="0" w:color="D9D9D9"/>
+              <w:bottom w:val="single" w:sz="4" w:space="0" w:color="D9D9D9"/>
+              <w:right w:val="single" w:sz="4" w:space="0" w:color="D9D9D9"/>
+            </w:tcBorders>
+            <w:shd w:val="clear" w:color="auto" w:fill="FFF9D6"/>
+            <w:vAlign w:val="center"/>
+          </w:tcPr>
+          <w:p>
+            <w:r>
+              <w:rPr>
+                <w:color w:val="000000"/>
+                <w:sz w:val="19"/>
+                <w:szCs w:val="19"/>
+              </w:rPr>
+              <w:t xml:space="preserve">Número decimal mayor o igual a 0. Costo por unidad de la última compra (lo actualiza la base al registrar una compra).</w:t>
+            </w:r>
+          </w:p>
+        </w:tc>
+      </w:tr>
+      <w:tr>
+        <w:tc>
+          <w:tcPr>
+            <w:tcW w:w="829" w:type="pct"/>
+            <w:tcBorders>
+              <w:top w:val="single" w:sz="4" w:space="0" w:color="D9D9D9"/>
+              <w:left w:val="single" w:sz="4" w:space="0" w:color="D9D9D9"/>
+              <w:bottom w:val="single" w:sz="4" w:space="0" w:color="D9D9D9"/>
+              <w:right w:val="single" w:sz="4" w:space="0" w:color="D9D9D9"/>
+            </w:tcBorders>
+            <w:shd w:val="clear" w:color="auto" w:fill="FFF9D6"/>
+            <w:tcMar>
+              <w:top w:w="100" w:type="dxa"/>
+              <w:left w:w="150" w:type="dxa"/>
+              <w:bottom w:w="100" w:type="dxa"/>
+              <w:right w:w="150" w:type="dxa"/>
+            </w:tcMar>
+            <w:vAlign w:val="center"/>
+          </w:tcPr>
+          <w:p>
+            <w:pPr>
+              <w:rPr>
+                <w:b/>
+                <w:bCs/>
+              </w:rPr>
+            </w:pPr>
+            <w:r>
+              <w:rPr>
+                <w:b/>
+                <w:bCs/>
+                <w:color w:val="000000"/>
+                <w:sz w:val="19"/>
+                <w:szCs w:val="19"/>
+              </w:rPr>
               <w:t>precio_venta</w:t>
             </w:r>
           </w:p>
@@ -9171,6 +8441,186 @@
                 <w:szCs w:val="19"/>
               </w:rPr>
               <w:t>Número decimal mayor o igual a 0. Precio de venta al público por unidad.</w:t>
+            </w:r>
+          </w:p>
+        </w:tc>
+      </w:tr>
+      <w:tr>
+        <w:tc>
+          <w:tcPr>
+            <w:tcW w:w="829" w:type="pct"/>
+            <w:tcBorders>
+              <w:top w:val="single" w:sz="4" w:space="0" w:color="D9D9D9"/>
+              <w:left w:val="single" w:sz="4" w:space="0" w:color="D9D9D9"/>
+              <w:bottom w:val="single" w:sz="4" w:space="0" w:color="D9D9D9"/>
+              <w:right w:val="single" w:sz="4" w:space="0" w:color="D9D9D9"/>
+            </w:tcBorders>
+            <w:shd w:val="clear" w:color="auto" w:fill="FFF9D6"/>
+            <w:tcMar>
+              <w:top w:w="100" w:type="dxa"/>
+              <w:left w:w="150" w:type="dxa"/>
+              <w:bottom w:w="100" w:type="dxa"/>
+              <w:right w:w="150" w:type="dxa"/>
+            </w:tcMar>
+            <w:vAlign w:val="center"/>
+          </w:tcPr>
+          <w:p>
+            <w:pPr>
+              <w:rPr>
+                <w:b/>
+                <w:bCs/>
+              </w:rPr>
+            </w:pPr>
+            <w:r>
+              <w:rPr>
+                <w:b/>
+                <w:bCs/>
+                <w:color w:val="000000"/>
+                <w:sz w:val="19"/>
+                <w:szCs w:val="19"/>
+              </w:rPr>
+              <w:t xml:space="preserve">activo</w:t>
+            </w:r>
+          </w:p>
+        </w:tc>
+        <w:tc>
+          <w:tcPr>
+            <w:tcW w:w="500" w:type="pct"/>
+            <w:tcBorders>
+              <w:top w:val="single" w:sz="4" w:space="0" w:color="D9D9D9"/>
+              <w:left w:val="single" w:sz="4" w:space="0" w:color="D9D9D9"/>
+              <w:bottom w:val="single" w:sz="4" w:space="0" w:color="D9D9D9"/>
+              <w:right w:val="single" w:sz="4" w:space="0" w:color="D9D9D9"/>
+            </w:tcBorders>
+            <w:shd w:val="clear" w:color="auto" w:fill="FFF9D6"/>
+            <w:tcMar>
+              <w:top w:w="100" w:type="dxa"/>
+              <w:left w:w="150" w:type="dxa"/>
+              <w:bottom w:w="100" w:type="dxa"/>
+              <w:right w:w="150" w:type="dxa"/>
+            </w:tcMar>
+            <w:vAlign w:val="center"/>
+          </w:tcPr>
+          <w:p>
+            <w:pPr>
+              <w:rPr>
+                <w:b/>
+                <w:bCs/>
+              </w:rPr>
+            </w:pPr>
+            <w:r>
+              <w:rPr>
+                <w:b/>
+                <w:bCs/>
+                <w:color w:val="000000"/>
+                <w:sz w:val="19"/>
+                <w:szCs w:val="19"/>
+              </w:rPr>
+              <w:t xml:space="preserve"/>
+            </w:r>
+          </w:p>
+        </w:tc>
+        <w:tc>
+          <w:tcPr>
+            <w:tcW w:w="619" w:type="pct"/>
+            <w:tcBorders>
+              <w:top w:val="single" w:sz="4" w:space="0" w:color="D9D9D9"/>
+              <w:left w:val="single" w:sz="4" w:space="0" w:color="D9D9D9"/>
+              <w:bottom w:val="single" w:sz="4" w:space="0" w:color="D9D9D9"/>
+              <w:right w:val="single" w:sz="4" w:space="0" w:color="D9D9D9"/>
+            </w:tcBorders>
+            <w:shd w:val="clear" w:color="auto" w:fill="FFF9D6"/>
+            <w:tcMar>
+              <w:top w:w="100" w:type="dxa"/>
+              <w:left w:w="150" w:type="dxa"/>
+              <w:bottom w:w="100" w:type="dxa"/>
+              <w:right w:w="150" w:type="dxa"/>
+            </w:tcMar>
+            <w:vAlign w:val="center"/>
+          </w:tcPr>
+          <w:p>
+            <w:r>
+              <w:rPr>
+                <w:color w:val="000000"/>
+                <w:sz w:val="19"/>
+                <w:szCs w:val="19"/>
+              </w:rPr>
+              <w:t xml:space="preserve">BOOLEAN</w:t>
+            </w:r>
+          </w:p>
+        </w:tc>
+        <w:tc>
+          <w:tcPr>
+            <w:tcW w:w="1017" w:type="pct"/>
+            <w:tcBorders>
+              <w:top w:val="single" w:sz="4" w:space="0" w:color="D9D9D9"/>
+              <w:left w:val="single" w:sz="4" w:space="0" w:color="D9D9D9"/>
+              <w:bottom w:val="single" w:sz="4" w:space="0" w:color="D9D9D9"/>
+              <w:right w:val="single" w:sz="4" w:space="0" w:color="D9D9D9"/>
+            </w:tcBorders>
+            <w:shd w:val="clear" w:color="auto" w:fill="FFF9D6"/>
+            <w:tcMar>
+              <w:top w:w="100" w:type="dxa"/>
+              <w:left w:w="150" w:type="dxa"/>
+              <w:bottom w:w="100" w:type="dxa"/>
+              <w:right w:w="150" w:type="dxa"/>
+            </w:tcMar>
+            <w:vAlign w:val="center"/>
+          </w:tcPr>
+          <w:p>
+            <w:r>
+              <w:rPr>
+                <w:color w:val="000000"/>
+                <w:sz w:val="19"/>
+                <w:szCs w:val="19"/>
+              </w:rPr>
+              <w:t xml:space="preserve">1 byte</w:t>
+            </w:r>
+          </w:p>
+        </w:tc>
+        <w:tc>
+          <w:tcPr>
+            <w:tcW w:w="1017" w:type="pct"/>
+            <w:tcBorders>
+              <w:top w:val="single" w:sz="4" w:space="0" w:color="D9D9D9"/>
+              <w:left w:val="single" w:sz="4" w:space="0" w:color="D9D9D9"/>
+              <w:bottom w:val="single" w:sz="4" w:space="0" w:color="D9D9D9"/>
+              <w:right w:val="single" w:sz="4" w:space="0" w:color="D9D9D9"/>
+            </w:tcBorders>
+            <w:shd w:val="clear" w:color="auto" w:fill="FFF9D6"/>
+            <w:vAlign w:val="center"/>
+          </w:tcPr>
+          <w:p>
+            <w:r>
+              <w:rPr>
+                <w:color w:val="000000"/>
+                <w:sz w:val="19"/>
+                <w:szCs w:val="19"/>
+              </w:rPr>
+              <w:t xml:space="preserve">NOT NULL</w:t>
+            </w:r>
+          </w:p>
+        </w:tc>
+        <w:tc>
+          <w:tcPr>
+            <w:tcW w:w="1018" w:type="pct"/>
+            <w:tcBorders>
+              <w:top w:val="single" w:sz="4" w:space="0" w:color="D9D9D9"/>
+              <w:left w:val="single" w:sz="4" w:space="0" w:color="D9D9D9"/>
+              <w:bottom w:val="single" w:sz="4" w:space="0" w:color="D9D9D9"/>
+              <w:right w:val="single" w:sz="4" w:space="0" w:color="D9D9D9"/>
+            </w:tcBorders>
+            <w:shd w:val="clear" w:color="auto" w:fill="FFF9D6"/>
+            <w:vAlign w:val="center"/>
+          </w:tcPr>
+          <w:p>
+            <w:r>
+              <w:rPr>
+                <w:color w:val="000000"/>
+                <w:sz w:val="19"/>
+                <w:szCs w:val="19"/>
+              </w:rPr>
+              <w:t xml:space="preserve">TRUE = producto a la venta; FALSE = dado de baja (baja lógica, no se puede vender). Valor por defecto: TRUE.</w:t>
             </w:r>
           </w:p>
         </w:tc>
@@ -9193,16 +8643,7 @@
           <w:sz w:val="24"/>
           <w:szCs w:val="24"/>
         </w:rPr>
-        <w:t xml:space="preserve">Tabla </w:t>
-      </w:r>
-      <w:r>
-        <w:rPr>
-          <w:b/>
-          <w:bCs/>
-          <w:sz w:val="24"/>
-          <w:szCs w:val="24"/>
-        </w:rPr>
-        <w:t>planta</w:t>
+        <w:t xml:space="preserve">Tabla planta</w:t>
       </w:r>
     </w:p>
     <w:tbl>
@@ -9883,7 +9324,7 @@
                 <w:sz w:val="19"/>
                 <w:szCs w:val="19"/>
               </w:rPr>
-              <w:t>VARCHAR</w:t>
+              <w:t xml:space="preserve">ENUM</w:t>
             </w:r>
           </w:p>
         </w:tc>
@@ -9912,7 +9353,7 @@
                 <w:sz w:val="19"/>
                 <w:szCs w:val="19"/>
               </w:rPr>
-              <w:t>50 caracteres</w:t>
+              <w:t xml:space="preserve">1 byte</w:t>
             </w:r>
           </w:p>
         </w:tc>
@@ -9958,7 +9399,7 @@
                 <w:sz w:val="19"/>
                 <w:szCs w:val="19"/>
               </w:rPr>
-              <w:t>Texto con la categoría de la planta (ej.: suculenta, aromática, frutal).</w:t>
+              <w:t xml:space="preserve">Valores permitidos: 'suculenta', 'cactus', 'aromática', 'frutal', 'ornamental', 'arbusto', 'árbol', 'flor de estación'.</w:t>
             </w:r>
           </w:p>
         </w:tc>
@@ -10337,8 +9778,7 @@
                 <w:sz w:val="19"/>
                 <w:szCs w:val="19"/>
               </w:rPr>
-              <w:lastRenderedPageBreak/>
-              <w:t>descripcion2</w:t>
+              <w:t>nivel_de_luz</w:t>
             </w:r>
           </w:p>
         </w:tc>
@@ -10394,7 +9834,7 @@
                 <w:sz w:val="19"/>
                 <w:szCs w:val="19"/>
               </w:rPr>
-              <w:t>VARCHAR</w:t>
+              <w:t>ENUM</w:t>
             </w:r>
           </w:p>
         </w:tc>
@@ -10423,7 +9863,7 @@
                 <w:sz w:val="19"/>
                 <w:szCs w:val="19"/>
               </w:rPr>
-              <w:t>100 caracteres</w:t>
+              <w:t>1 byte</w:t>
             </w:r>
           </w:p>
         </w:tc>
@@ -10446,7 +9886,7 @@
                 <w:sz w:val="19"/>
                 <w:szCs w:val="19"/>
               </w:rPr>
-              <w:t>NULL</w:t>
+              <w:t>NOT NULL</w:t>
             </w:r>
           </w:p>
         </w:tc>
@@ -10469,7 +9909,7 @@
                 <w:sz w:val="19"/>
                 <w:szCs w:val="19"/>
               </w:rPr>
-              <w:t>Texto con la descripción complementaria.</w:t>
+              <w:t>Valores permitidos: 'bajo', 'medio', 'alto'.</w:t>
             </w:r>
           </w:p>
         </w:tc>
@@ -10508,7 +9948,7 @@
                 <w:sz w:val="19"/>
                 <w:szCs w:val="19"/>
               </w:rPr>
-              <w:t>nivel_de_luz</w:t>
+              <w:t>riego_cada_dias</w:t>
             </w:r>
           </w:p>
         </w:tc>
@@ -10564,7 +10004,7 @@
                 <w:sz w:val="19"/>
                 <w:szCs w:val="19"/>
               </w:rPr>
-              <w:t>ENUM</w:t>
+              <w:t>SMALLINT</w:t>
             </w:r>
           </w:p>
         </w:tc>
@@ -10593,7 +10033,7 @@
                 <w:sz w:val="19"/>
                 <w:szCs w:val="19"/>
               </w:rPr>
-              <w:t>1 byte</w:t>
+              <w:t>2 bytes</w:t>
             </w:r>
           </w:p>
         </w:tc>
@@ -10639,7 +10079,7 @@
                 <w:sz w:val="19"/>
                 <w:szCs w:val="19"/>
               </w:rPr>
-              <w:t>Valores permitidos: 'bajo', 'medio', 'alto'.</w:t>
+              <w:t>Entero entre 1 y 365. Cada cuántos días se riega.</w:t>
             </w:r>
           </w:p>
         </w:tc>
@@ -10678,7 +10118,7 @@
                 <w:sz w:val="19"/>
                 <w:szCs w:val="19"/>
               </w:rPr>
-              <w:t>riego_cada_dias</w:t>
+              <w:t xml:space="preserve">id_producto</w:t>
             </w:r>
           </w:p>
         </w:tc>
@@ -10707,6 +10147,16 @@
                 <w:bCs/>
               </w:rPr>
             </w:pPr>
+            <w:r>
+              <w:rPr>
+                <w:b/>
+                <w:bCs/>
+                <w:color w:val="000000"/>
+                <w:sz w:val="19"/>
+                <w:szCs w:val="19"/>
+              </w:rPr>
+              <w:t xml:space="preserve">FK, UQ</w:t>
+            </w:r>
           </w:p>
         </w:tc>
         <w:tc>
@@ -10734,7 +10184,7 @@
                 <w:sz w:val="19"/>
                 <w:szCs w:val="19"/>
               </w:rPr>
-              <w:t>SMALLINT</w:t>
+              <w:t>INT</w:t>
             </w:r>
           </w:p>
         </w:tc>
@@ -10763,7 +10213,7 @@
                 <w:sz w:val="19"/>
                 <w:szCs w:val="19"/>
               </w:rPr>
-              <w:t>2 bytes</w:t>
+              <w:t>4 bytes</w:t>
             </w:r>
           </w:p>
         </w:tc>
@@ -10809,187 +10259,7 @@
                 <w:sz w:val="19"/>
                 <w:szCs w:val="19"/>
               </w:rPr>
-              <w:t>Entero entre 1 y 365. Cada cuántos días se riega.</w:t>
-            </w:r>
-          </w:p>
-        </w:tc>
-      </w:tr>
-      <w:tr>
-        <w:tc>
-          <w:tcPr>
-            <w:tcW w:w="780" w:type="pct"/>
-            <w:tcBorders>
-              <w:top w:val="single" w:sz="4" w:space="0" w:color="D9D9D9"/>
-              <w:left w:val="single" w:sz="4" w:space="0" w:color="D9D9D9"/>
-              <w:bottom w:val="single" w:sz="4" w:space="0" w:color="D9D9D9"/>
-              <w:right w:val="single" w:sz="4" w:space="0" w:color="D9D9D9"/>
-            </w:tcBorders>
-            <w:shd w:val="clear" w:color="auto" w:fill="FFF9D6"/>
-            <w:tcMar>
-              <w:top w:w="100" w:type="dxa"/>
-              <w:left w:w="150" w:type="dxa"/>
-              <w:bottom w:w="100" w:type="dxa"/>
-              <w:right w:w="150" w:type="dxa"/>
-            </w:tcMar>
-            <w:vAlign w:val="center"/>
-          </w:tcPr>
-          <w:p>
-            <w:pPr>
-              <w:rPr>
-                <w:b/>
-                <w:bCs/>
-              </w:rPr>
-            </w:pPr>
-            <w:r>
-              <w:rPr>
-                <w:b/>
-                <w:bCs/>
-                <w:color w:val="000000"/>
-                <w:sz w:val="19"/>
-                <w:szCs w:val="19"/>
-              </w:rPr>
-              <w:t>id_inventario</w:t>
-            </w:r>
-          </w:p>
-        </w:tc>
-        <w:tc>
-          <w:tcPr>
-            <w:tcW w:w="510" w:type="pct"/>
-            <w:tcBorders>
-              <w:top w:val="single" w:sz="4" w:space="0" w:color="D9D9D9"/>
-              <w:left w:val="single" w:sz="4" w:space="0" w:color="D9D9D9"/>
-              <w:bottom w:val="single" w:sz="4" w:space="0" w:color="D9D9D9"/>
-              <w:right w:val="single" w:sz="4" w:space="0" w:color="D9D9D9"/>
-            </w:tcBorders>
-            <w:shd w:val="clear" w:color="auto" w:fill="FFF9D6"/>
-            <w:tcMar>
-              <w:top w:w="100" w:type="dxa"/>
-              <w:left w:w="150" w:type="dxa"/>
-              <w:bottom w:w="100" w:type="dxa"/>
-              <w:right w:w="150" w:type="dxa"/>
-            </w:tcMar>
-            <w:vAlign w:val="center"/>
-          </w:tcPr>
-          <w:p>
-            <w:pPr>
-              <w:rPr>
-                <w:b/>
-                <w:bCs/>
-              </w:rPr>
-            </w:pPr>
-            <w:r>
-              <w:rPr>
-                <w:b/>
-                <w:bCs/>
-                <w:color w:val="000000"/>
-                <w:sz w:val="19"/>
-                <w:szCs w:val="19"/>
-              </w:rPr>
-              <w:t>FK</w:t>
-            </w:r>
-          </w:p>
-        </w:tc>
-        <w:tc>
-          <w:tcPr>
-            <w:tcW w:w="629" w:type="pct"/>
-            <w:tcBorders>
-              <w:top w:val="single" w:sz="4" w:space="0" w:color="D9D9D9"/>
-              <w:left w:val="single" w:sz="4" w:space="0" w:color="D9D9D9"/>
-              <w:bottom w:val="single" w:sz="4" w:space="0" w:color="D9D9D9"/>
-              <w:right w:val="single" w:sz="4" w:space="0" w:color="D9D9D9"/>
-            </w:tcBorders>
-            <w:shd w:val="clear" w:color="auto" w:fill="FFF9D6"/>
-            <w:tcMar>
-              <w:top w:w="100" w:type="dxa"/>
-              <w:left w:w="150" w:type="dxa"/>
-              <w:bottom w:w="100" w:type="dxa"/>
-              <w:right w:w="150" w:type="dxa"/>
-            </w:tcMar>
-            <w:vAlign w:val="center"/>
-          </w:tcPr>
-          <w:p>
-            <w:r>
-              <w:rPr>
-                <w:color w:val="000000"/>
-                <w:sz w:val="19"/>
-                <w:szCs w:val="19"/>
-              </w:rPr>
-              <w:t>INT</w:t>
-            </w:r>
-          </w:p>
-        </w:tc>
-        <w:tc>
-          <w:tcPr>
-            <w:tcW w:w="1027" w:type="pct"/>
-            <w:tcBorders>
-              <w:top w:val="single" w:sz="4" w:space="0" w:color="D9D9D9"/>
-              <w:left w:val="single" w:sz="4" w:space="0" w:color="D9D9D9"/>
-              <w:bottom w:val="single" w:sz="4" w:space="0" w:color="D9D9D9"/>
-              <w:right w:val="single" w:sz="4" w:space="0" w:color="D9D9D9"/>
-            </w:tcBorders>
-            <w:shd w:val="clear" w:color="auto" w:fill="FFF9D6"/>
-            <w:tcMar>
-              <w:top w:w="100" w:type="dxa"/>
-              <w:left w:w="150" w:type="dxa"/>
-              <w:bottom w:w="100" w:type="dxa"/>
-              <w:right w:w="150" w:type="dxa"/>
-            </w:tcMar>
-            <w:vAlign w:val="center"/>
-          </w:tcPr>
-          <w:p>
-            <w:r>
-              <w:rPr>
-                <w:color w:val="000000"/>
-                <w:sz w:val="19"/>
-                <w:szCs w:val="19"/>
-              </w:rPr>
-              <w:t>4 bytes</w:t>
-            </w:r>
-          </w:p>
-        </w:tc>
-        <w:tc>
-          <w:tcPr>
-            <w:tcW w:w="1027" w:type="pct"/>
-            <w:tcBorders>
-              <w:top w:val="single" w:sz="4" w:space="0" w:color="D9D9D9"/>
-              <w:left w:val="single" w:sz="4" w:space="0" w:color="D9D9D9"/>
-              <w:bottom w:val="single" w:sz="4" w:space="0" w:color="D9D9D9"/>
-              <w:right w:val="single" w:sz="4" w:space="0" w:color="D9D9D9"/>
-            </w:tcBorders>
-            <w:shd w:val="clear" w:color="auto" w:fill="FFF9D6"/>
-            <w:vAlign w:val="center"/>
-          </w:tcPr>
-          <w:p>
-            <w:r>
-              <w:rPr>
-                <w:color w:val="000000"/>
-                <w:sz w:val="19"/>
-                <w:szCs w:val="19"/>
-              </w:rPr>
-              <w:t>NOT NULL</w:t>
-            </w:r>
-          </w:p>
-        </w:tc>
-        <w:tc>
-          <w:tcPr>
-            <w:tcW w:w="1027" w:type="pct"/>
-            <w:tcBorders>
-              <w:top w:val="single" w:sz="4" w:space="0" w:color="D9D9D9"/>
-              <w:left w:val="single" w:sz="4" w:space="0" w:color="D9D9D9"/>
-              <w:bottom w:val="single" w:sz="4" w:space="0" w:color="D9D9D9"/>
-              <w:right w:val="single" w:sz="4" w:space="0" w:color="D9D9D9"/>
-            </w:tcBorders>
-            <w:shd w:val="clear" w:color="auto" w:fill="FFF9D6"/>
-            <w:vAlign w:val="center"/>
-          </w:tcPr>
-          <w:p>
-            <w:r>
-              <w:rPr>
-                <w:color w:val="000000"/>
-                <w:sz w:val="19"/>
-                <w:szCs w:val="19"/>
-              </w:rPr>
-              <w:t xml:space="preserve">Valor existente en inventario. </w:t>
+              <w:t xml:space="preserve">Valor existente en producto. No se repite: cada producto tiene a lo sumo una planta y no puede ser también un insumo.</w:t>
             </w:r>
           </w:p>
         </w:tc>
@@ -11012,16 +10282,7 @@
           <w:sz w:val="24"/>
           <w:szCs w:val="24"/>
         </w:rPr>
-        <w:t xml:space="preserve">Tabla </w:t>
-      </w:r>
-      <w:r>
-        <w:rPr>
-          <w:b/>
-          <w:bCs/>
-          <w:sz w:val="24"/>
-          <w:szCs w:val="24"/>
-        </w:rPr>
-        <w:t>insumo</w:t>
+        <w:t xml:space="preserve">Tabla insumo</w:t>
       </w:r>
     </w:p>
     <w:tbl>
@@ -11646,7 +10907,7 @@
                 <w:sz w:val="19"/>
                 <w:szCs w:val="19"/>
               </w:rPr>
-              <w:t>descripcion1</w:t>
+              <w:t xml:space="preserve">descripcion</w:t>
             </w:r>
           </w:p>
         </w:tc>
@@ -11777,7 +11038,7 @@
                 <w:sz w:val="19"/>
                 <w:szCs w:val="19"/>
               </w:rPr>
-              <w:t>Texto con la descripción general del insumo.</w:t>
+              <w:t xml:space="preserve">Texto con la descripción general del insumo.</w:t>
             </w:r>
           </w:p>
         </w:tc>
@@ -11816,7 +11077,7 @@
                 <w:sz w:val="19"/>
                 <w:szCs w:val="19"/>
               </w:rPr>
-              <w:t>descripcion2</w:t>
+              <w:t xml:space="preserve">id_producto</w:t>
             </w:r>
           </w:p>
         </w:tc>
@@ -11845,6 +11106,16 @@
                 <w:bCs/>
               </w:rPr>
             </w:pPr>
+            <w:r>
+              <w:rPr>
+                <w:b/>
+                <w:bCs/>
+                <w:color w:val="000000"/>
+                <w:sz w:val="19"/>
+                <w:szCs w:val="19"/>
+              </w:rPr>
+              <w:t xml:space="preserve">FK, UQ</w:t>
+            </w:r>
           </w:p>
         </w:tc>
         <w:tc>
@@ -11872,7 +11143,7 @@
                 <w:sz w:val="19"/>
                 <w:szCs w:val="19"/>
               </w:rPr>
-              <w:t>VARCHAR</w:t>
+              <w:t>INT</w:t>
             </w:r>
           </w:p>
         </w:tc>
@@ -11901,7 +11172,7 @@
                 <w:sz w:val="19"/>
                 <w:szCs w:val="19"/>
               </w:rPr>
-              <w:t>100 caracteres</w:t>
+              <w:t>4 bytes</w:t>
             </w:r>
           </w:p>
         </w:tc>
@@ -11924,7 +11195,7 @@
                 <w:sz w:val="19"/>
                 <w:szCs w:val="19"/>
               </w:rPr>
-              <w:t>NULL</w:t>
+              <w:t>NOT NULL</w:t>
             </w:r>
           </w:p>
         </w:tc>
@@ -11947,187 +11218,7 @@
                 <w:sz w:val="19"/>
                 <w:szCs w:val="19"/>
               </w:rPr>
-              <w:t>Texto con la descripción complementaria.</w:t>
-            </w:r>
-          </w:p>
-        </w:tc>
-      </w:tr>
-      <w:tr>
-        <w:tc>
-          <w:tcPr>
-            <w:tcW w:w="771" w:type="pct"/>
-            <w:tcBorders>
-              <w:top w:val="single" w:sz="4" w:space="0" w:color="D9D9D9"/>
-              <w:left w:val="single" w:sz="4" w:space="0" w:color="D9D9D9"/>
-              <w:bottom w:val="single" w:sz="4" w:space="0" w:color="D9D9D9"/>
-              <w:right w:val="single" w:sz="4" w:space="0" w:color="D9D9D9"/>
-            </w:tcBorders>
-            <w:shd w:val="clear" w:color="auto" w:fill="FFF9D6"/>
-            <w:tcMar>
-              <w:top w:w="100" w:type="dxa"/>
-              <w:left w:w="150" w:type="dxa"/>
-              <w:bottom w:w="100" w:type="dxa"/>
-              <w:right w:w="150" w:type="dxa"/>
-            </w:tcMar>
-            <w:vAlign w:val="center"/>
-          </w:tcPr>
-          <w:p>
-            <w:pPr>
-              <w:rPr>
-                <w:b/>
-                <w:bCs/>
-              </w:rPr>
-            </w:pPr>
-            <w:r>
-              <w:rPr>
-                <w:b/>
-                <w:bCs/>
-                <w:color w:val="000000"/>
-                <w:sz w:val="19"/>
-                <w:szCs w:val="19"/>
-              </w:rPr>
-              <w:t>id_inventario</w:t>
-            </w:r>
-          </w:p>
-        </w:tc>
-        <w:tc>
-          <w:tcPr>
-            <w:tcW w:w="501" w:type="pct"/>
-            <w:tcBorders>
-              <w:top w:val="single" w:sz="4" w:space="0" w:color="D9D9D9"/>
-              <w:left w:val="single" w:sz="4" w:space="0" w:color="D9D9D9"/>
-              <w:bottom w:val="single" w:sz="4" w:space="0" w:color="D9D9D9"/>
-              <w:right w:val="single" w:sz="4" w:space="0" w:color="D9D9D9"/>
-            </w:tcBorders>
-            <w:shd w:val="clear" w:color="auto" w:fill="FFF9D6"/>
-            <w:tcMar>
-              <w:top w:w="100" w:type="dxa"/>
-              <w:left w:w="150" w:type="dxa"/>
-              <w:bottom w:w="100" w:type="dxa"/>
-              <w:right w:w="150" w:type="dxa"/>
-            </w:tcMar>
-            <w:vAlign w:val="center"/>
-          </w:tcPr>
-          <w:p>
-            <w:pPr>
-              <w:rPr>
-                <w:b/>
-                <w:bCs/>
-              </w:rPr>
-            </w:pPr>
-            <w:r>
-              <w:rPr>
-                <w:b/>
-                <w:bCs/>
-                <w:color w:val="000000"/>
-                <w:sz w:val="19"/>
-                <w:szCs w:val="19"/>
-              </w:rPr>
-              <w:t>FK</w:t>
-            </w:r>
-          </w:p>
-        </w:tc>
-        <w:tc>
-          <w:tcPr>
-            <w:tcW w:w="620" w:type="pct"/>
-            <w:tcBorders>
-              <w:top w:val="single" w:sz="4" w:space="0" w:color="D9D9D9"/>
-              <w:left w:val="single" w:sz="4" w:space="0" w:color="D9D9D9"/>
-              <w:bottom w:val="single" w:sz="4" w:space="0" w:color="D9D9D9"/>
-              <w:right w:val="single" w:sz="4" w:space="0" w:color="D9D9D9"/>
-            </w:tcBorders>
-            <w:shd w:val="clear" w:color="auto" w:fill="FFF9D6"/>
-            <w:tcMar>
-              <w:top w:w="100" w:type="dxa"/>
-              <w:left w:w="150" w:type="dxa"/>
-              <w:bottom w:w="100" w:type="dxa"/>
-              <w:right w:w="150" w:type="dxa"/>
-            </w:tcMar>
-            <w:vAlign w:val="center"/>
-          </w:tcPr>
-          <w:p>
-            <w:r>
-              <w:rPr>
-                <w:color w:val="000000"/>
-                <w:sz w:val="19"/>
-                <w:szCs w:val="19"/>
-              </w:rPr>
-              <w:t>INT</w:t>
-            </w:r>
-          </w:p>
-        </w:tc>
-        <w:tc>
-          <w:tcPr>
-            <w:tcW w:w="1018" w:type="pct"/>
-            <w:tcBorders>
-              <w:top w:val="single" w:sz="4" w:space="0" w:color="D9D9D9"/>
-              <w:left w:val="single" w:sz="4" w:space="0" w:color="D9D9D9"/>
-              <w:bottom w:val="single" w:sz="4" w:space="0" w:color="D9D9D9"/>
-              <w:right w:val="single" w:sz="4" w:space="0" w:color="D9D9D9"/>
-            </w:tcBorders>
-            <w:shd w:val="clear" w:color="auto" w:fill="FFF9D6"/>
-            <w:tcMar>
-              <w:top w:w="100" w:type="dxa"/>
-              <w:left w:w="150" w:type="dxa"/>
-              <w:bottom w:w="100" w:type="dxa"/>
-              <w:right w:w="150" w:type="dxa"/>
-            </w:tcMar>
-            <w:vAlign w:val="center"/>
-          </w:tcPr>
-          <w:p>
-            <w:r>
-              <w:rPr>
-                <w:color w:val="000000"/>
-                <w:sz w:val="19"/>
-                <w:szCs w:val="19"/>
-              </w:rPr>
-              <w:t>4 bytes</w:t>
-            </w:r>
-          </w:p>
-        </w:tc>
-        <w:tc>
-          <w:tcPr>
-            <w:tcW w:w="1019" w:type="pct"/>
-            <w:tcBorders>
-              <w:top w:val="single" w:sz="4" w:space="0" w:color="D9D9D9"/>
-              <w:left w:val="single" w:sz="4" w:space="0" w:color="D9D9D9"/>
-              <w:bottom w:val="single" w:sz="4" w:space="0" w:color="D9D9D9"/>
-              <w:right w:val="single" w:sz="4" w:space="0" w:color="D9D9D9"/>
-            </w:tcBorders>
-            <w:shd w:val="clear" w:color="auto" w:fill="FFF9D6"/>
-            <w:vAlign w:val="center"/>
-          </w:tcPr>
-          <w:p>
-            <w:r>
-              <w:rPr>
-                <w:color w:val="000000"/>
-                <w:sz w:val="19"/>
-                <w:szCs w:val="19"/>
-              </w:rPr>
-              <w:t>NOT NULL</w:t>
-            </w:r>
-          </w:p>
-        </w:tc>
-        <w:tc>
-          <w:tcPr>
-            <w:tcW w:w="1071" w:type="pct"/>
-            <w:tcBorders>
-              <w:top w:val="single" w:sz="4" w:space="0" w:color="D9D9D9"/>
-              <w:left w:val="single" w:sz="4" w:space="0" w:color="D9D9D9"/>
-              <w:bottom w:val="single" w:sz="4" w:space="0" w:color="D9D9D9"/>
-              <w:right w:val="single" w:sz="4" w:space="0" w:color="D9D9D9"/>
-            </w:tcBorders>
-            <w:shd w:val="clear" w:color="auto" w:fill="FFF9D6"/>
-            <w:vAlign w:val="center"/>
-          </w:tcPr>
-          <w:p>
-            <w:r>
-              <w:rPr>
-                <w:color w:val="000000"/>
-                <w:sz w:val="19"/>
-                <w:szCs w:val="19"/>
-              </w:rPr>
-              <w:t>Valor existente en inventario.</w:t>
+              <w:t xml:space="preserve">Valor existente en producto. No se repite: cada producto tiene a lo sumo un insumo y no puede ser también una planta.</w:t>
             </w:r>
           </w:p>
         </w:tc>
@@ -12150,16 +11241,7 @@
           <w:sz w:val="24"/>
           <w:szCs w:val="24"/>
         </w:rPr>
-        <w:t>Tabla ven</w:t>
-      </w:r>
-      <w:r>
-        <w:rPr>
-          <w:b/>
-          <w:bCs/>
-          <w:sz w:val="24"/>
-          <w:szCs w:val="24"/>
-        </w:rPr>
-        <w:t>ta</w:t>
+        <w:t>Tabla venta</w:t>
       </w:r>
     </w:p>
     <w:tbl>
@@ -12745,7 +11827,7 @@
                 <w:sz w:val="19"/>
                 <w:szCs w:val="19"/>
               </w:rPr>
-              <w:t>Fecha válida en formato DD-MM-AAAA, no posterior a la fecha actual.</w:t>
+              <w:t xml:space="preserve">Fecha válida, no posterior a la fecha actual (lo controla un trigger). Valor por defecto: la fecha del día.</w:t>
             </w:r>
           </w:p>
         </w:tc>
@@ -13086,7 +12168,7 @@
                 <w:sz w:val="19"/>
                 <w:szCs w:val="19"/>
               </w:rPr>
-              <w:t>Número decimal mayor o igual a 0. Importe total de la venta.</w:t>
+              <w:t xml:space="preserve">Número decimal mayor o igual a 0. Importe total de la venta: suma de los subtotales de sus detalles (lo calcula la base).</w:t>
             </w:r>
           </w:p>
         </w:tc>
@@ -13266,7 +12348,7 @@
                 <w:sz w:val="19"/>
                 <w:szCs w:val="19"/>
               </w:rPr>
-              <w:t>Valor existente en cliente.</w:t>
+              <w:t xml:space="preserve">Valor existente en cliente. Las ventas a clientes no identificados se asignan al cliente “Consumidor final”.</w:t>
             </w:r>
           </w:p>
         </w:tc>
@@ -13469,16 +12551,7 @@
           <w:sz w:val="24"/>
           <w:szCs w:val="24"/>
         </w:rPr>
-        <w:t xml:space="preserve">Tabla </w:t>
-      </w:r>
-      <w:r>
-        <w:rPr>
-          <w:b/>
-          <w:bCs/>
-          <w:sz w:val="24"/>
-          <w:szCs w:val="24"/>
-        </w:rPr>
-        <w:t>detalle_venta</w:t>
+        <w:t xml:space="preserve">Tabla detalle_venta</w:t>
       </w:r>
     </w:p>
     <w:tbl>
@@ -14113,7 +13186,7 @@
                 <w:sz w:val="19"/>
                 <w:szCs w:val="19"/>
               </w:rPr>
-              <w:t>id_inventario</w:t>
+              <w:t xml:space="preserve">id_producto</w:t>
             </w:r>
           </w:p>
         </w:tc>
@@ -14254,7 +13327,7 @@
                 <w:sz w:val="19"/>
                 <w:szCs w:val="19"/>
               </w:rPr>
-              <w:t>Valor existente en inventario.</w:t>
+              <w:t xml:space="preserve">Valor existente en producto. No se repite dentro de una misma venta (UNIQUE id_venta, id_producto).</w:t>
             </w:r>
           </w:p>
         </w:tc>
@@ -14463,6 +13536,186 @@
                 <w:sz w:val="19"/>
                 <w:szCs w:val="19"/>
               </w:rPr>
+              <w:t xml:space="preserve">precio_unitario</w:t>
+            </w:r>
+          </w:p>
+        </w:tc>
+        <w:tc>
+          <w:tcPr>
+            <w:tcW w:w="468" w:type="pct"/>
+            <w:tcBorders>
+              <w:top w:val="single" w:sz="4" w:space="0" w:color="D9D9D9"/>
+              <w:left w:val="single" w:sz="4" w:space="0" w:color="D9D9D9"/>
+              <w:bottom w:val="single" w:sz="4" w:space="0" w:color="D9D9D9"/>
+              <w:right w:val="single" w:sz="4" w:space="0" w:color="D9D9D9"/>
+            </w:tcBorders>
+            <w:shd w:val="clear" w:color="auto" w:fill="FFF9D6"/>
+            <w:tcMar>
+              <w:top w:w="100" w:type="dxa"/>
+              <w:left w:w="150" w:type="dxa"/>
+              <w:bottom w:w="100" w:type="dxa"/>
+              <w:right w:w="150" w:type="dxa"/>
+            </w:tcMar>
+            <w:vAlign w:val="center"/>
+          </w:tcPr>
+          <w:p>
+            <w:pPr>
+              <w:rPr>
+                <w:b/>
+                <w:bCs/>
+              </w:rPr>
+            </w:pPr>
+            <w:r>
+              <w:rPr>
+                <w:b/>
+                <w:bCs/>
+                <w:color w:val="000000"/>
+                <w:sz w:val="19"/>
+                <w:szCs w:val="19"/>
+              </w:rPr>
+              <w:t xml:space="preserve"/>
+            </w:r>
+          </w:p>
+        </w:tc>
+        <w:tc>
+          <w:tcPr>
+            <w:tcW w:w="587" w:type="pct"/>
+            <w:tcBorders>
+              <w:top w:val="single" w:sz="4" w:space="0" w:color="D9D9D9"/>
+              <w:left w:val="single" w:sz="4" w:space="0" w:color="D9D9D9"/>
+              <w:bottom w:val="single" w:sz="4" w:space="0" w:color="D9D9D9"/>
+              <w:right w:val="single" w:sz="4" w:space="0" w:color="D9D9D9"/>
+            </w:tcBorders>
+            <w:shd w:val="clear" w:color="auto" w:fill="FFF9D6"/>
+            <w:tcMar>
+              <w:top w:w="100" w:type="dxa"/>
+              <w:left w:w="150" w:type="dxa"/>
+              <w:bottom w:w="100" w:type="dxa"/>
+              <w:right w:w="150" w:type="dxa"/>
+            </w:tcMar>
+            <w:vAlign w:val="center"/>
+          </w:tcPr>
+          <w:p>
+            <w:r>
+              <w:rPr>
+                <w:color w:val="000000"/>
+                <w:sz w:val="19"/>
+                <w:szCs w:val="19"/>
+              </w:rPr>
+              <w:t xml:space="preserve">DECIMAL</w:t>
+            </w:r>
+          </w:p>
+        </w:tc>
+        <w:tc>
+          <w:tcPr>
+            <w:tcW w:w="985" w:type="pct"/>
+            <w:tcBorders>
+              <w:top w:val="single" w:sz="4" w:space="0" w:color="D9D9D9"/>
+              <w:left w:val="single" w:sz="4" w:space="0" w:color="D9D9D9"/>
+              <w:bottom w:val="single" w:sz="4" w:space="0" w:color="D9D9D9"/>
+              <w:right w:val="single" w:sz="4" w:space="0" w:color="D9D9D9"/>
+            </w:tcBorders>
+            <w:shd w:val="clear" w:color="auto" w:fill="FFF9D6"/>
+            <w:tcMar>
+              <w:top w:w="100" w:type="dxa"/>
+              <w:left w:w="150" w:type="dxa"/>
+              <w:bottom w:w="100" w:type="dxa"/>
+              <w:right w:w="150" w:type="dxa"/>
+            </w:tcMar>
+            <w:vAlign w:val="center"/>
+          </w:tcPr>
+          <w:p>
+            <w:r>
+              <w:rPr>
+                <w:color w:val="000000"/>
+                <w:sz w:val="19"/>
+                <w:szCs w:val="19"/>
+              </w:rPr>
+              <w:t xml:space="preserve">10 dígitos (2 decimales)</w:t>
+            </w:r>
+          </w:p>
+        </w:tc>
+        <w:tc>
+          <w:tcPr>
+            <w:tcW w:w="985" w:type="pct"/>
+            <w:tcBorders>
+              <w:top w:val="single" w:sz="4" w:space="0" w:color="D9D9D9"/>
+              <w:left w:val="single" w:sz="4" w:space="0" w:color="D9D9D9"/>
+              <w:bottom w:val="single" w:sz="4" w:space="0" w:color="D9D9D9"/>
+              <w:right w:val="single" w:sz="4" w:space="0" w:color="D9D9D9"/>
+            </w:tcBorders>
+            <w:shd w:val="clear" w:color="auto" w:fill="FFF9D6"/>
+            <w:vAlign w:val="center"/>
+          </w:tcPr>
+          <w:p>
+            <w:r>
+              <w:rPr>
+                <w:color w:val="000000"/>
+                <w:sz w:val="19"/>
+                <w:szCs w:val="19"/>
+              </w:rPr>
+              <w:t xml:space="preserve">NOT NULL</w:t>
+            </w:r>
+          </w:p>
+        </w:tc>
+        <w:tc>
+          <w:tcPr>
+            <w:tcW w:w="1071" w:type="pct"/>
+            <w:tcBorders>
+              <w:top w:val="single" w:sz="4" w:space="0" w:color="D9D9D9"/>
+              <w:left w:val="single" w:sz="4" w:space="0" w:color="D9D9D9"/>
+              <w:bottom w:val="single" w:sz="4" w:space="0" w:color="D9D9D9"/>
+              <w:right w:val="single" w:sz="4" w:space="0" w:color="D9D9D9"/>
+            </w:tcBorders>
+            <w:shd w:val="clear" w:color="auto" w:fill="FFF9D6"/>
+            <w:vAlign w:val="center"/>
+          </w:tcPr>
+          <w:p>
+            <w:r>
+              <w:rPr>
+                <w:color w:val="000000"/>
+                <w:sz w:val="19"/>
+                <w:szCs w:val="19"/>
+              </w:rPr>
+              <w:t xml:space="preserve">Número decimal mayor o igual a 0. Precio cobrado por unidad al momento de la venta.</w:t>
+            </w:r>
+          </w:p>
+        </w:tc>
+      </w:tr>
+      <w:tr>
+        <w:tc>
+          <w:tcPr>
+            <w:tcW w:w="905" w:type="pct"/>
+            <w:tcBorders>
+              <w:top w:val="single" w:sz="4" w:space="0" w:color="D9D9D9"/>
+              <w:left w:val="single" w:sz="4" w:space="0" w:color="D9D9D9"/>
+              <w:bottom w:val="single" w:sz="4" w:space="0" w:color="D9D9D9"/>
+              <w:right w:val="single" w:sz="4" w:space="0" w:color="D9D9D9"/>
+            </w:tcBorders>
+            <w:shd w:val="clear" w:color="auto" w:fill="FFF9D6"/>
+            <w:tcMar>
+              <w:top w:w="100" w:type="dxa"/>
+              <w:left w:w="150" w:type="dxa"/>
+              <w:bottom w:w="100" w:type="dxa"/>
+              <w:right w:w="150" w:type="dxa"/>
+            </w:tcMar>
+            <w:vAlign w:val="center"/>
+          </w:tcPr>
+          <w:p>
+            <w:pPr>
+              <w:rPr>
+                <w:b/>
+                <w:bCs/>
+              </w:rPr>
+            </w:pPr>
+            <w:r>
+              <w:rPr>
+                <w:b/>
+                <w:bCs/>
+                <w:color w:val="000000"/>
+                <w:sz w:val="19"/>
+                <w:szCs w:val="19"/>
+              </w:rPr>
               <w:t>subtotal</w:t>
             </w:r>
           </w:p>
@@ -14594,7 +13847,7 @@
                 <w:sz w:val="19"/>
                 <w:szCs w:val="19"/>
               </w:rPr>
-              <w:t xml:space="preserve">Número decimal mayor o igual a 0. </w:t>
+              <w:t xml:space="preserve">Número decimal mayor o igual a 0. Resulta de cantidad × precio_unitario (lo calcula la base).</w:t>
             </w:r>
           </w:p>
         </w:tc>
@@ -14617,16 +13870,7 @@
           <w:sz w:val="24"/>
           <w:szCs w:val="24"/>
         </w:rPr>
-        <w:t xml:space="preserve">Tabla </w:t>
-      </w:r>
-      <w:r>
-        <w:rPr>
-          <w:b/>
-          <w:bCs/>
-          <w:sz w:val="24"/>
-          <w:szCs w:val="24"/>
-        </w:rPr>
-        <w:t>compra</w:t>
+        <w:t xml:space="preserve">Tabla compra</w:t>
       </w:r>
     </w:p>
     <w:tbl>
@@ -15212,7 +14456,7 @@
                 <w:sz w:val="19"/>
                 <w:szCs w:val="19"/>
               </w:rPr>
-              <w:t>Fecha válida en formato DD-MM-AAAA, no posterior a la fecha actual.</w:t>
+              <w:t xml:space="preserve">Fecha válida, no posterior a la fecha actual (lo controla un trigger). Valor por defecto: la fecha del día.</w:t>
             </w:r>
           </w:p>
         </w:tc>
@@ -15553,7 +14797,7 @@
                 <w:sz w:val="19"/>
                 <w:szCs w:val="19"/>
               </w:rPr>
-              <w:t>Número decimal mayor o igual a 0. Importe total de la compra.</w:t>
+              <w:t xml:space="preserve">Número decimal mayor o igual a 0. Importe total de la compra: suma de los subtotales de sus detalles (lo calcula la base).</w:t>
             </w:r>
           </w:p>
         </w:tc>
@@ -15756,16 +15000,7 @@
           <w:sz w:val="24"/>
           <w:szCs w:val="24"/>
         </w:rPr>
-        <w:t xml:space="preserve">Tabla </w:t>
-      </w:r>
-      <w:r>
-        <w:rPr>
-          <w:b/>
-          <w:bCs/>
-          <w:sz w:val="24"/>
-          <w:szCs w:val="24"/>
-        </w:rPr>
-        <w:t>detalle_compra</w:t>
+        <w:t xml:space="preserve">Tabla detalle_compra</w:t>
       </w:r>
     </w:p>
     <w:tbl>
@@ -16390,7 +15625,7 @@
                 <w:sz w:val="19"/>
                 <w:szCs w:val="19"/>
               </w:rPr>
-              <w:t>subtotal</w:t>
+              <w:t xml:space="preserve">precio_unitario</w:t>
             </w:r>
           </w:p>
         </w:tc>
@@ -16419,6 +15654,16 @@
                 <w:bCs/>
               </w:rPr>
             </w:pPr>
+            <w:r>
+              <w:rPr>
+                <w:b/>
+                <w:bCs/>
+                <w:color w:val="000000"/>
+                <w:sz w:val="19"/>
+                <w:szCs w:val="19"/>
+              </w:rPr>
+              <w:t xml:space="preserve"/>
+            </w:r>
           </w:p>
         </w:tc>
         <w:tc>
@@ -16446,7 +15691,7 @@
                 <w:sz w:val="19"/>
                 <w:szCs w:val="19"/>
               </w:rPr>
-              <w:t>DECIMAL</w:t>
+              <w:t xml:space="preserve">DECIMAL</w:t>
             </w:r>
           </w:p>
         </w:tc>
@@ -16475,7 +15720,7 @@
                 <w:sz w:val="19"/>
                 <w:szCs w:val="19"/>
               </w:rPr>
-              <w:t>10 dígitos (2 decimales)</w:t>
+              <w:t xml:space="preserve">10 dígitos (2 decimales)</w:t>
             </w:r>
           </w:p>
         </w:tc>
@@ -16498,7 +15743,7 @@
                 <w:sz w:val="19"/>
                 <w:szCs w:val="19"/>
               </w:rPr>
-              <w:t>NOT NULL</w:t>
+              <w:t xml:space="preserve">NOT NULL</w:t>
             </w:r>
           </w:p>
         </w:tc>
@@ -16521,7 +15766,7 @@
                 <w:sz w:val="19"/>
                 <w:szCs w:val="19"/>
               </w:rPr>
-              <w:t>Número decimal mayor o igual a 0. Resulta de cantidad × precio de compra.</w:t>
+              <w:t xml:space="preserve">Número decimal mayor o igual a 0. Precio pagado por unidad en esta compra; pasa a ser el precio_compra del producto.</w:t>
             </w:r>
           </w:p>
         </w:tc>
@@ -16560,7 +15805,7 @@
                 <w:sz w:val="19"/>
                 <w:szCs w:val="19"/>
               </w:rPr>
-              <w:t>id_inventario</w:t>
+              <w:t>subtotal</w:t>
             </w:r>
           </w:p>
         </w:tc>
@@ -16589,6 +15834,176 @@
                 <w:bCs/>
               </w:rPr>
             </w:pPr>
+          </w:p>
+        </w:tc>
+        <w:tc>
+          <w:tcPr>
+            <w:tcW w:w="566" w:type="pct"/>
+            <w:tcBorders>
+              <w:top w:val="single" w:sz="4" w:space="0" w:color="D9D9D9"/>
+              <w:left w:val="single" w:sz="4" w:space="0" w:color="D9D9D9"/>
+              <w:bottom w:val="single" w:sz="4" w:space="0" w:color="D9D9D9"/>
+              <w:right w:val="single" w:sz="4" w:space="0" w:color="D9D9D9"/>
+            </w:tcBorders>
+            <w:shd w:val="clear" w:color="auto" w:fill="FFF9D6"/>
+            <w:tcMar>
+              <w:top w:w="100" w:type="dxa"/>
+              <w:left w:w="150" w:type="dxa"/>
+              <w:bottom w:w="100" w:type="dxa"/>
+              <w:right w:w="150" w:type="dxa"/>
+            </w:tcMar>
+            <w:vAlign w:val="center"/>
+          </w:tcPr>
+          <w:p>
+            <w:r>
+              <w:rPr>
+                <w:color w:val="000000"/>
+                <w:sz w:val="19"/>
+                <w:szCs w:val="19"/>
+              </w:rPr>
+              <w:t>DECIMAL</w:t>
+            </w:r>
+          </w:p>
+        </w:tc>
+        <w:tc>
+          <w:tcPr>
+            <w:tcW w:w="964" w:type="pct"/>
+            <w:tcBorders>
+              <w:top w:val="single" w:sz="4" w:space="0" w:color="D9D9D9"/>
+              <w:left w:val="single" w:sz="4" w:space="0" w:color="D9D9D9"/>
+              <w:bottom w:val="single" w:sz="4" w:space="0" w:color="D9D9D9"/>
+              <w:right w:val="single" w:sz="4" w:space="0" w:color="D9D9D9"/>
+            </w:tcBorders>
+            <w:shd w:val="clear" w:color="auto" w:fill="FFF9D6"/>
+            <w:tcMar>
+              <w:top w:w="100" w:type="dxa"/>
+              <w:left w:w="150" w:type="dxa"/>
+              <w:bottom w:w="100" w:type="dxa"/>
+              <w:right w:w="150" w:type="dxa"/>
+            </w:tcMar>
+            <w:vAlign w:val="center"/>
+          </w:tcPr>
+          <w:p>
+            <w:r>
+              <w:rPr>
+                <w:color w:val="000000"/>
+                <w:sz w:val="19"/>
+                <w:szCs w:val="19"/>
+              </w:rPr>
+              <w:t>10 dígitos (2 decimales)</w:t>
+            </w:r>
+          </w:p>
+        </w:tc>
+        <w:tc>
+          <w:tcPr>
+            <w:tcW w:w="964" w:type="pct"/>
+            <w:tcBorders>
+              <w:top w:val="single" w:sz="4" w:space="0" w:color="D9D9D9"/>
+              <w:left w:val="single" w:sz="4" w:space="0" w:color="D9D9D9"/>
+              <w:bottom w:val="single" w:sz="4" w:space="0" w:color="D9D9D9"/>
+              <w:right w:val="single" w:sz="4" w:space="0" w:color="D9D9D9"/>
+            </w:tcBorders>
+            <w:shd w:val="clear" w:color="auto" w:fill="FFF9D6"/>
+            <w:vAlign w:val="center"/>
+          </w:tcPr>
+          <w:p>
+            <w:r>
+              <w:rPr>
+                <w:color w:val="000000"/>
+                <w:sz w:val="19"/>
+                <w:szCs w:val="19"/>
+              </w:rPr>
+              <w:t>NOT NULL</w:t>
+            </w:r>
+          </w:p>
+        </w:tc>
+        <w:tc>
+          <w:tcPr>
+            <w:tcW w:w="1071" w:type="pct"/>
+            <w:tcBorders>
+              <w:top w:val="single" w:sz="4" w:space="0" w:color="D9D9D9"/>
+              <w:left w:val="single" w:sz="4" w:space="0" w:color="D9D9D9"/>
+              <w:bottom w:val="single" w:sz="4" w:space="0" w:color="D9D9D9"/>
+              <w:right w:val="single" w:sz="4" w:space="0" w:color="D9D9D9"/>
+            </w:tcBorders>
+            <w:shd w:val="clear" w:color="auto" w:fill="FFF9D6"/>
+            <w:vAlign w:val="center"/>
+          </w:tcPr>
+          <w:p>
+            <w:r>
+              <w:rPr>
+                <w:color w:val="000000"/>
+                <w:sz w:val="19"/>
+                <w:szCs w:val="19"/>
+              </w:rPr>
+              <w:t xml:space="preserve">Número decimal mayor o igual a 0. Resulta de cantidad × precio_unitario (lo calcula la base).</w:t>
+            </w:r>
+          </w:p>
+        </w:tc>
+      </w:tr>
+      <w:tr>
+        <w:tc>
+          <w:tcPr>
+            <w:tcW w:w="989" w:type="pct"/>
+            <w:tcBorders>
+              <w:top w:val="single" w:sz="4" w:space="0" w:color="D9D9D9"/>
+              <w:left w:val="single" w:sz="4" w:space="0" w:color="D9D9D9"/>
+              <w:bottom w:val="single" w:sz="4" w:space="0" w:color="D9D9D9"/>
+              <w:right w:val="single" w:sz="4" w:space="0" w:color="D9D9D9"/>
+            </w:tcBorders>
+            <w:shd w:val="clear" w:color="auto" w:fill="FFF9D6"/>
+            <w:tcMar>
+              <w:top w:w="100" w:type="dxa"/>
+              <w:left w:w="150" w:type="dxa"/>
+              <w:bottom w:w="100" w:type="dxa"/>
+              <w:right w:w="150" w:type="dxa"/>
+            </w:tcMar>
+            <w:vAlign w:val="center"/>
+          </w:tcPr>
+          <w:p>
+            <w:pPr>
+              <w:rPr>
+                <w:b/>
+                <w:bCs/>
+              </w:rPr>
+            </w:pPr>
+            <w:r>
+              <w:rPr>
+                <w:b/>
+                <w:bCs/>
+                <w:color w:val="000000"/>
+                <w:sz w:val="19"/>
+                <w:szCs w:val="19"/>
+              </w:rPr>
+              <w:t xml:space="preserve">id_producto</w:t>
+            </w:r>
+          </w:p>
+        </w:tc>
+        <w:tc>
+          <w:tcPr>
+            <w:tcW w:w="446" w:type="pct"/>
+            <w:tcBorders>
+              <w:top w:val="single" w:sz="4" w:space="0" w:color="D9D9D9"/>
+              <w:left w:val="single" w:sz="4" w:space="0" w:color="D9D9D9"/>
+              <w:bottom w:val="single" w:sz="4" w:space="0" w:color="D9D9D9"/>
+              <w:right w:val="single" w:sz="4" w:space="0" w:color="D9D9D9"/>
+            </w:tcBorders>
+            <w:shd w:val="clear" w:color="auto" w:fill="FFF9D6"/>
+            <w:tcMar>
+              <w:top w:w="100" w:type="dxa"/>
+              <w:left w:w="150" w:type="dxa"/>
+              <w:bottom w:w="100" w:type="dxa"/>
+              <w:right w:w="150" w:type="dxa"/>
+            </w:tcMar>
+            <w:vAlign w:val="center"/>
+          </w:tcPr>
+          <w:p>
+            <w:pPr>
+              <w:rPr>
+                <w:b/>
+                <w:bCs/>
+              </w:rPr>
+            </w:pPr>
             <w:r>
               <w:rPr>
                 <w:b/>
@@ -16701,7 +16116,7 @@
                 <w:sz w:val="19"/>
                 <w:szCs w:val="19"/>
               </w:rPr>
-              <w:t>Valor existente en inventario.</w:t>
+              <w:t xml:space="preserve">Valor existente en producto. No se repite dentro de una misma compra (UNIQUE id_compra, id_producto).</w:t>
             </w:r>
           </w:p>
         </w:tc>
@@ -16907,15 +16322,6 @@
           <w:szCs w:val="30"/>
         </w:rPr>
         <w:br w:type="page"/>
-      </w:r>
-      <w:r>
-        <w:rPr>
-          <w:b/>
-          <w:bCs/>
-          <w:color w:val="1F2A44"/>
-          <w:sz w:val="30"/>
-          <w:szCs w:val="30"/>
-        </w:rPr>
         <w:lastRenderedPageBreak/>
         <w:t>5. Definición de Claves</w:t>
       </w:r>
@@ -17328,7 +16734,7 @@
                 <w:sz w:val="19"/>
                 <w:szCs w:val="19"/>
               </w:rPr>
-              <w:t>Clave sustituta. El cuit es una clave natural candidata, pero es un texto de 13 caracteres con guiones y puede cambiar (corrección o cambio de razón social). El cuit se conserva como UNIQUE.</w:t>
+              <w:t xml:space="preserve">Clave sustituta. El cuit es una clave natural candidata, pero puede cargarse con errores o cambiar (corrección o cambio de razón social). El cuit se conserva como UNIQUE.</w:t>
             </w:r>
           </w:p>
         </w:tc>
@@ -17370,7 +16776,7 @@
                 <w:sz w:val="19"/>
                 <w:szCs w:val="19"/>
               </w:rPr>
-              <w:t>inventario</w:t>
+              <w:t xml:space="preserve">producto</w:t>
             </w:r>
           </w:p>
         </w:tc>
@@ -17410,7 +16816,7 @@
                 <w:sz w:val="19"/>
                 <w:szCs w:val="19"/>
               </w:rPr>
-              <w:t>id_inventario</w:t>
+              <w:t xml:space="preserve">id_producto</w:t>
             </w:r>
           </w:p>
         </w:tc>
@@ -17446,7 +16852,7 @@
                 <w:sz w:val="19"/>
                 <w:szCs w:val="19"/>
               </w:rPr>
-              <w:t>Clave sustituta. La tabla no tiene un código de producto natural: el stock y los precios cambian, y el nombre está en planta o insumo, no en inventario.</w:t>
+              <w:t xml:space="preserve">Clave sustituta. La tabla no tiene un código de producto natural: el stock y los precios cambian, y el nombre está en planta o insumo, no en producto.</w:t>
             </w:r>
           </w:p>
         </w:tc>
@@ -17918,7 +17324,7 @@
                 <w:sz w:val="19"/>
                 <w:szCs w:val="19"/>
               </w:rPr>
-              <w:t>Clave sustituta. La alternativa natural sería la clave compuesta (id_venta, id_inventario), pero un id propio simplifica las referencias y permite repetir un producto dentro de la misma venta.</w:t>
+              <w:t xml:space="preserve">Clave sustituta. La alternativa natural sería la clave compuesta (id_venta, id_producto); se conserva como UNIQUE para que un producto aparezca una sola vez por venta (si se llevan más unidades, se aumenta la cantidad).</w:t>
             </w:r>
           </w:p>
         </w:tc>
@@ -18154,7 +17560,7 @@
                 <w:sz w:val="19"/>
                 <w:szCs w:val="19"/>
               </w:rPr>
-              <w:t>Clave sustituta. La alternativa natural sería la clave compuesta (id_compra, id_inventario), pero un id propio simplifica las referencias y permite repetir un producto dentro de la misma compra.</w:t>
+              <w:t xml:space="preserve">Clave sustituta. La alternativa natural sería la clave compuesta (id_compra, id_producto); se conserva como UNIQUE para que un producto aparezca una sola vez por compra.</w:t>
             </w:r>
           </w:p>
         </w:tc>
@@ -18763,7 +18169,7 @@
                 <w:sz w:val="19"/>
                 <w:szCs w:val="19"/>
               </w:rPr>
-              <w:t>id_inventario</w:t>
+              <w:t xml:space="preserve">id_producto</w:t>
             </w:r>
           </w:p>
         </w:tc>
@@ -18792,7 +18198,7 @@
                 <w:sz w:val="19"/>
                 <w:szCs w:val="19"/>
               </w:rPr>
-              <w:t>inventario (id_inventario)</w:t>
+              <w:t xml:space="preserve">producto (id_producto)</w:t>
             </w:r>
           </w:p>
         </w:tc>
@@ -18888,7 +18294,7 @@
                 <w:sz w:val="19"/>
                 <w:szCs w:val="19"/>
               </w:rPr>
-              <w:t>id_inventario</w:t>
+              <w:t xml:space="preserve">id_producto</w:t>
             </w:r>
           </w:p>
         </w:tc>
@@ -18917,7 +18323,7 @@
                 <w:sz w:val="19"/>
                 <w:szCs w:val="19"/>
               </w:rPr>
-              <w:t>inventario (id_inventario)</w:t>
+              <w:t xml:space="preserve">producto (id_producto)</w:t>
             </w:r>
           </w:p>
         </w:tc>
@@ -19013,7 +18419,7 @@
                 <w:sz w:val="19"/>
                 <w:szCs w:val="19"/>
               </w:rPr>
-              <w:t>id_inventario</w:t>
+              <w:t xml:space="preserve">id_producto</w:t>
             </w:r>
           </w:p>
         </w:tc>
@@ -19042,7 +18448,7 @@
                 <w:sz w:val="19"/>
                 <w:szCs w:val="19"/>
               </w:rPr>
-              <w:t>inventario (id_inventario)</w:t>
+              <w:t xml:space="preserve">producto (id_producto)</w:t>
             </w:r>
           </w:p>
         </w:tc>
@@ -19388,7 +18794,7 @@
                 <w:sz w:val="19"/>
                 <w:szCs w:val="19"/>
               </w:rPr>
-              <w:t>id_inventario</w:t>
+              <w:t xml:space="preserve">id_producto</w:t>
             </w:r>
           </w:p>
         </w:tc>
@@ -19417,7 +18823,7 @@
                 <w:sz w:val="19"/>
                 <w:szCs w:val="19"/>
               </w:rPr>
-              <w:t>inventario (id_inventario)</w:t>
+              <w:t xml:space="preserve">producto (id_producto)</w:t>
             </w:r>
           </w:p>
         </w:tc>
@@ -19452,6 +18858,11 @@
         </w:tc>
       </w:tr>
     </w:tbl>
+    <w:p>
+      <w:r>
+        <w:t xml:space="preserve">En MySQL las acciones en cascada no disparan triggers. Por eso, al borrar una venta o una compra, los triggers trg_venta_bd y trg_compra_bd ajustan el stock antes de que la cascada elimine sus detalles. Un producto que ya tiene ventas o compras no se puede borrar (RESTRICT): se da de baja con activo = FALSE.</w:t>
+      </w:r>
+    </w:p>
     <w:p>
       <w:pPr>
         <w:pageBreakBefore/>
@@ -19485,7 +18896,7 @@
         </w:rPr>
         <w:drawing>
           <wp:inline distT="0" distB="0" distL="0" distR="0" wp14:anchorId="4E72F810" wp14:editId="6092A103">
-            <wp:extent cx="5731510" cy="3463925"/>
+            <wp:extent cx="5731510" cy="3392824"/>
             <wp:effectExtent l="0" t="0" r="2540" b="3175"/>
             <wp:docPr id="1736867757" name="Imagen 1"/>
             <wp:cNvGraphicFramePr>
@@ -19513,7 +18924,7 @@
                   <pic:spPr>
                     <a:xfrm>
                       <a:off x="0" y="0"/>
-                      <a:ext cx="5731510" cy="3463925"/>
+                      <a:ext cx="5731510" cy="3392824"/>
                     </a:xfrm>
                     <a:prstGeom prst="rect">
                       <a:avLst/>
@@ -20037,7 +19448,7 @@
                 <w:sz w:val="19"/>
                 <w:szCs w:val="19"/>
               </w:rPr>
-              <w:t>Entidad: Inventario</w:t>
+              <w:t xml:space="preserve">Entidad: Producto</w:t>
             </w:r>
           </w:p>
         </w:tc>
@@ -20068,7 +19479,7 @@
                 <w:sz w:val="19"/>
                 <w:szCs w:val="19"/>
               </w:rPr>
-              <w:t>inventario</w:t>
+              <w:t xml:space="preserve">producto</w:t>
             </w:r>
           </w:p>
         </w:tc>
@@ -20097,7 +19508,7 @@
                 <w:sz w:val="19"/>
                 <w:szCs w:val="19"/>
               </w:rPr>
-              <w:t xml:space="preserve">Tabla propia con PK sustituta id_inventario. </w:t>
+              <w:t xml:space="preserve">Tabla propia con PK sustituta id_producto. Es el supertipo de la especialización: guarda los datos comunes a plantas e insumos (stock, stock mínimo, precios y estado).</w:t>
             </w:r>
           </w:p>
         </w:tc>
@@ -20310,7 +19721,7 @@
                 <w:sz w:val="19"/>
                 <w:szCs w:val="19"/>
               </w:rPr>
-              <w:t>Entidad: Detalle de venta/ Relación: Realiza</w:t>
+              <w:t xml:space="preserve">Entidad: Detalle de venta/ Relación: Incluye</w:t>
             </w:r>
           </w:p>
         </w:tc>
@@ -20370,7 +19781,7 @@
                 <w:sz w:val="19"/>
                 <w:szCs w:val="19"/>
               </w:rPr>
-              <w:t>Su existencia depende de una venta. Tabla con PK sustituta id_detalle_venta y FK obligatoria a venta. Es la tabla intermedia de la relación N:M Venta–Inventario.</w:t>
+              <w:t xml:space="preserve">Su existencia depende de una venta. Tabla con PK sustituta id_detalle_venta y FK obligatoria a venta. Es la tabla intermedia de la relación N:M Venta–Producto.</w:t>
             </w:r>
           </w:p>
         </w:tc>
@@ -20401,15 +19812,7 @@
                 <w:sz w:val="19"/>
                 <w:szCs w:val="19"/>
               </w:rPr>
-              <w:t>Entidad: Detalle de compra</w:t>
-            </w:r>
-            <w:r>
-              <w:rPr>
-                <w:color w:val="000000"/>
-                <w:sz w:val="19"/>
-                <w:szCs w:val="19"/>
-              </w:rPr>
-              <w:t>/ Relación: Incluye</w:t>
+              <w:t xml:space="preserve">Entidad: Detalle de compra/ Relación: Adquiere</w:t>
             </w:r>
           </w:p>
         </w:tc>
@@ -20469,23 +19872,7 @@
                 <w:sz w:val="19"/>
                 <w:szCs w:val="19"/>
               </w:rPr>
-              <w:t xml:space="preserve">Su existencia depende de una compra. Tabla con PK sustituta id_detalle_compra y FK obligatoria a compra. </w:t>
-            </w:r>
-            <w:r>
-              <w:rPr>
-                <w:color w:val="000000"/>
-                <w:sz w:val="19"/>
-                <w:szCs w:val="19"/>
-              </w:rPr>
-              <w:t>E</w:t>
-            </w:r>
-            <w:r>
-              <w:rPr>
-                <w:color w:val="000000"/>
-                <w:sz w:val="19"/>
-                <w:szCs w:val="19"/>
-              </w:rPr>
-              <w:t>s la tabla intermedia de la relación N:M Compra–Inventario.</w:t>
+              <w:t xml:space="preserve">Su existencia depende de una compra. Tabla con PK sustituta id_detalle_compra y FK obligatoria a compra. Es la tabla intermedia de la relación N:M Compra–Producto.</w:t>
             </w:r>
           </w:p>
         </w:tc>
@@ -20516,15 +19903,7 @@
                 <w:sz w:val="19"/>
                 <w:szCs w:val="19"/>
               </w:rPr>
-              <w:t>Entidad</w:t>
-            </w:r>
-            <w:r>
-              <w:rPr>
-                <w:color w:val="000000"/>
-                <w:sz w:val="19"/>
-                <w:szCs w:val="19"/>
-              </w:rPr>
-              <w:t>: Planta</w:t>
+              <w:t>Entidad: Planta</w:t>
             </w:r>
           </w:p>
         </w:tc>
@@ -20584,39 +19963,7 @@
                 <w:sz w:val="19"/>
                 <w:szCs w:val="19"/>
               </w:rPr>
-              <w:t xml:space="preserve">Tabla propia con PK sustituta id_planta. </w:t>
-            </w:r>
-            <w:r>
-              <w:rPr>
-                <w:color w:val="000000"/>
-                <w:sz w:val="19"/>
-                <w:szCs w:val="19"/>
-              </w:rPr>
-              <w:t>M</w:t>
-            </w:r>
-            <w:r>
-              <w:rPr>
-                <w:color w:val="000000"/>
-                <w:sz w:val="19"/>
-                <w:szCs w:val="19"/>
-              </w:rPr>
-              <w:t>ediante la FK id_inventario</w:t>
-            </w:r>
-            <w:r>
-              <w:rPr>
-                <w:color w:val="000000"/>
-                <w:sz w:val="19"/>
-                <w:szCs w:val="19"/>
-              </w:rPr>
-              <w:t>, toma su id</w:t>
-            </w:r>
-            <w:r>
-              <w:rPr>
-                <w:color w:val="000000"/>
-                <w:sz w:val="19"/>
-                <w:szCs w:val="19"/>
-              </w:rPr>
-              <w:t>.</w:t>
+              <w:t xml:space="preserve">Tabla propia con PK sustituta id_planta. Se vincula 1:1 con su producto mediante la FK id_producto, que es UNIQUE.</w:t>
             </w:r>
           </w:p>
         </w:tc>
@@ -20647,15 +19994,7 @@
                 <w:sz w:val="19"/>
                 <w:szCs w:val="19"/>
               </w:rPr>
-              <w:t>Entidad</w:t>
-            </w:r>
-            <w:r>
-              <w:rPr>
-                <w:color w:val="000000"/>
-                <w:sz w:val="19"/>
-                <w:szCs w:val="19"/>
-              </w:rPr>
-              <w:t>: Insumo</w:t>
+              <w:t>Entidad: Insumo</w:t>
             </w:r>
           </w:p>
         </w:tc>
@@ -20715,23 +20054,7 @@
                 <w:sz w:val="19"/>
                 <w:szCs w:val="19"/>
               </w:rPr>
-              <w:t>Tabla propia con PK sustituta id_</w:t>
-            </w:r>
-            <w:r>
-              <w:rPr>
-                <w:color w:val="000000"/>
-                <w:sz w:val="19"/>
-                <w:szCs w:val="19"/>
-              </w:rPr>
-              <w:t>insumo</w:t>
-            </w:r>
-            <w:r>
-              <w:rPr>
-                <w:color w:val="000000"/>
-                <w:sz w:val="19"/>
-                <w:szCs w:val="19"/>
-              </w:rPr>
-              <w:t>. Mediante la FK id_inventario, toma su id.</w:t>
+              <w:t xml:space="preserve">Tabla propia con PK sustituta id_insumo. Se vincula 1:1 con su producto mediante la FK id_producto, que es UNIQUE.</w:t>
             </w:r>
           </w:p>
         </w:tc>
@@ -20762,23 +20085,7 @@
                 <w:sz w:val="19"/>
                 <w:szCs w:val="19"/>
               </w:rPr>
-              <w:t xml:space="preserve">Relación 1:N: Vendedor </w:t>
-            </w:r>
-            <w:r>
-              <w:rPr>
-                <w:color w:val="000000"/>
-                <w:sz w:val="19"/>
-                <w:szCs w:val="19"/>
-              </w:rPr>
-              <w:t xml:space="preserve">realiza </w:t>
-            </w:r>
-            <w:r>
-              <w:rPr>
-                <w:color w:val="000000"/>
-                <w:sz w:val="19"/>
-                <w:szCs w:val="19"/>
-              </w:rPr>
-              <w:t>Venta</w:t>
+              <w:t xml:space="preserve">Relación 1:N: Vendedor realiza Venta</w:t>
             </w:r>
           </w:p>
         </w:tc>
@@ -20869,7 +20176,7 @@
                 <w:sz w:val="19"/>
                 <w:szCs w:val="19"/>
               </w:rPr>
-              <w:t>Relación 1:N: Cliente realiza Venta</w:t>
+              <w:t xml:space="preserve">Relación 1:N: Cliente recibe Venta</w:t>
             </w:r>
           </w:p>
         </w:tc>
@@ -20960,23 +20267,7 @@
                 <w:sz w:val="19"/>
                 <w:szCs w:val="19"/>
               </w:rPr>
-              <w:t>Relación 1:N: Proveedor</w:t>
-            </w:r>
-            <w:r>
-              <w:rPr>
-                <w:color w:val="000000"/>
-                <w:sz w:val="19"/>
-                <w:szCs w:val="19"/>
-              </w:rPr>
-              <w:t xml:space="preserve"> provee</w:t>
-            </w:r>
-            <w:r>
-              <w:rPr>
-                <w:color w:val="000000"/>
-                <w:sz w:val="19"/>
-                <w:szCs w:val="19"/>
-              </w:rPr>
-              <w:t xml:space="preserve"> Compra</w:t>
+              <w:t xml:space="preserve">Relación 1:N: Proveedor provee Compra</w:t>
             </w:r>
           </w:p>
         </w:tc>
@@ -21067,7 +20358,7 @@
                 <w:sz w:val="19"/>
                 <w:szCs w:val="19"/>
               </w:rPr>
-              <w:t xml:space="preserve">Relación N:M: Venta – Inventario  </w:t>
+              <w:t xml:space="preserve">Relación N:M: Venta – Producto (incluye)</w:t>
             </w:r>
           </w:p>
         </w:tc>
@@ -21127,7 +20418,7 @@
                 <w:sz w:val="19"/>
                 <w:szCs w:val="19"/>
               </w:rPr>
-              <w:t>Tabla intermedia. Contiene las FK id_venta e id_inventario, más los atributos propios de la relación: cantidad y subtotal.</w:t>
+              <w:t xml:space="preserve">Tabla intermedia. Contiene las FK id_venta e id_producto, más los atributos propios de la relación: cantidad, precio_unitario y subtotal.</w:t>
             </w:r>
           </w:p>
         </w:tc>
@@ -21158,8 +20449,7 @@
                 <w:sz w:val="19"/>
                 <w:szCs w:val="19"/>
               </w:rPr>
-              <w:lastRenderedPageBreak/>
-              <w:t xml:space="preserve">Relación N:M: Compra – Inventario </w:t>
+              <w:t xml:space="preserve">Relación N:M: Compra – Producto (adquiere)</w:t>
             </w:r>
           </w:p>
         </w:tc>
@@ -21219,7 +20509,7 @@
                 <w:sz w:val="19"/>
                 <w:szCs w:val="19"/>
               </w:rPr>
-              <w:t>Tabla intermedia. Contiene las FK id_compra e id_inventario, más los atributos propios de la relación: cantidad y subtotal.</w:t>
+              <w:t xml:space="preserve">Tabla intermedia. Contiene las FK id_compra e id_producto, más los atributos propios de la relación: cantidad, precio_unitario y subtotal.</w:t>
             </w:r>
           </w:p>
         </w:tc>
@@ -21250,31 +20540,7 @@
                 <w:sz w:val="19"/>
                 <w:szCs w:val="19"/>
               </w:rPr>
-              <w:t>Relación 1:1</w:t>
-            </w:r>
-            <w:r>
-              <w:rPr>
-                <w:color w:val="000000"/>
-                <w:sz w:val="19"/>
-                <w:szCs w:val="19"/>
-              </w:rPr>
-              <w:t xml:space="preserve">: Inventario </w:t>
-            </w:r>
-            <w:r>
-              <w:rPr>
-                <w:color w:val="000000"/>
-                <w:sz w:val="19"/>
-                <w:szCs w:val="19"/>
-              </w:rPr>
-              <w:t>-</w:t>
-            </w:r>
-            <w:r>
-              <w:rPr>
-                <w:color w:val="000000"/>
-                <w:sz w:val="19"/>
-                <w:szCs w:val="19"/>
-              </w:rPr>
-              <w:t xml:space="preserve"> Planta</w:t>
+              <w:t xml:space="preserve">Relación 1:1: Producto – Planta (contiene)</w:t>
             </w:r>
           </w:p>
         </w:tc>
@@ -21334,7 +20600,7 @@
                 <w:sz w:val="19"/>
                 <w:szCs w:val="19"/>
               </w:rPr>
-              <w:t>Estrategia de una tabla por subtipo. planta incluye la FK id_inventario que referencia a inventario.id_inventario; los atributos propios de las plantas quedan en planta.</w:t>
+              <w:t xml:space="preserve">Estrategia de una tabla por subtipo. planta incluye la FK id_producto (UNIQUE) que referencia a producto.id_producto; los atributos propios de las plantas quedan en planta. Un trigger impide que el mismo producto sea también un insumo.</w:t>
             </w:r>
           </w:p>
         </w:tc>
@@ -21365,31 +20631,7 @@
                 <w:sz w:val="19"/>
                 <w:szCs w:val="19"/>
               </w:rPr>
-              <w:t>Relación 1:1</w:t>
-            </w:r>
-            <w:r>
-              <w:rPr>
-                <w:color w:val="000000"/>
-                <w:sz w:val="19"/>
-                <w:szCs w:val="19"/>
-              </w:rPr>
-              <w:t xml:space="preserve">: Inventario </w:t>
-            </w:r>
-            <w:r>
-              <w:rPr>
-                <w:color w:val="000000"/>
-                <w:sz w:val="19"/>
-                <w:szCs w:val="19"/>
-              </w:rPr>
-              <w:t>-</w:t>
-            </w:r>
-            <w:r>
-              <w:rPr>
-                <w:color w:val="000000"/>
-                <w:sz w:val="19"/>
-                <w:szCs w:val="19"/>
-              </w:rPr>
-              <w:t xml:space="preserve"> Insumo</w:t>
+              <w:t xml:space="preserve">Relación 1:1: Producto – Insumo (contiene)</w:t>
             </w:r>
           </w:p>
         </w:tc>
@@ -21449,7 +20691,7 @@
                 <w:sz w:val="19"/>
                 <w:szCs w:val="19"/>
               </w:rPr>
-              <w:t>Estrategia de una tabla por subtipo. insumo incluye la FK id_inventario que referencia a inventario.id_inventario; los atributos propios de los insumos quedan en insumo.</w:t>
+              <w:t xml:space="preserve">Estrategia de una tabla por subtipo. insumo incluye la FK id_producto (UNIQUE) que referencia a producto.id_producto; los atributos propios de los insumos quedan en insumo. Un trigger impide que el mismo producto sea también una planta.</w:t>
             </w:r>
           </w:p>
         </w:tc>

</xml_diff>

<commit_message>
precio_compra opcional, ids por AUTO_INCREMENT y schema sin NULL explícitos
- producto.precio_compra acepta NULL (todavía sin compras); el informe
  (4.2) lo refleja. Las compras lo completan vía trigger.
- datos.sql: los ids los asigna AUTO_INCREMENT; solo se fija el cliente
  1 "Consumidor final". Los productos se cargan con precio_compra 0.
- schema.sql: se quitan los NULL y DEFAULT NULL explícitos (mismo
  comportamiento).
- README: precio_compra y id fijo del consumidor final.
</commit_message>
<xml_diff>
--- a/Informe.docx
+++ b/Informe.docx
@@ -8247,7 +8247,7 @@
                 <w:sz w:val="19"/>
                 <w:szCs w:val="19"/>
               </w:rPr>
-              <w:t>NOT NULL</w:t>
+              <w:t xml:space="preserve">NULL</w:t>
             </w:r>
           </w:p>
         </w:tc>
@@ -8270,7 +8270,7 @@
                 <w:sz w:val="19"/>
                 <w:szCs w:val="19"/>
               </w:rPr>
-              <w:t xml:space="preserve">Número decimal mayor o igual a 0. Costo por unidad de la última compra (lo actualiza la base al registrar una compra).</w:t>
+              <w:t xml:space="preserve">Número decimal mayor o igual a 0. Costo por unidad de la última compra (lo actualiza la base al registrar una compra). NULL mientras el producto no tenga compras (valor por defecto).</w:t>
             </w:r>
           </w:p>
         </w:tc>

</xml_diff>